<commit_message>
updated till chapter 2
</commit_message>
<xml_diff>
--- a/Thesis Report.docx
+++ b/Thesis Report.docx
@@ -1130,6 +1130,7 @@
         </w:rPr>
         <w:t xml:space="preserve"> </w:t>
       </w:r>
+      <w:proofErr w:type="gramStart"/>
       <w:r>
         <w:rPr>
           <w:i/>
@@ -1152,6 +1153,7 @@
         </w:rPr>
         <w:t>reproduce</w:t>
       </w:r>
+      <w:proofErr w:type="gramEnd"/>
       <w:r>
         <w:rPr>
           <w:i/>
@@ -1411,7 +1413,21 @@
         <w:rPr>
           <w:w w:val="95"/>
         </w:rPr>
-        <w:t>We have clearly stated the contribution of others to our thesis as a whole, including statistical assistance,</w:t>
+        <w:t xml:space="preserve">We have clearly stated the contribution of others to our </w:t>
+      </w:r>
+      <w:proofErr w:type="gramStart"/>
+      <w:r>
+        <w:rPr>
+          <w:w w:val="95"/>
+        </w:rPr>
+        <w:t>thesis as a whole, including</w:t>
+      </w:r>
+      <w:proofErr w:type="gramEnd"/>
+      <w:r>
+        <w:rPr>
+          <w:w w:val="95"/>
+        </w:rPr>
+        <w:t xml:space="preserve"> statistical assistance,</w:t>
       </w:r>
       <w:r>
         <w:rPr>
@@ -13790,7 +13806,25 @@
           <w:sz w:val="24"/>
           <w:szCs w:val="24"/>
         </w:rPr>
-        <w:t xml:space="preserve"> (Raihan &amp; Zampieri, 2025). But all of these models haven't been used in medical imaging so far and the study of </w:t>
+        <w:t xml:space="preserve"> (Raihan &amp; Zampieri, 2025). But </w:t>
+      </w:r>
+      <w:proofErr w:type="gramStart"/>
+      <w:r>
+        <w:rPr>
+          <w:iCs/>
+          <w:sz w:val="24"/>
+          <w:szCs w:val="24"/>
+        </w:rPr>
+        <w:t>all of</w:t>
+      </w:r>
+      <w:proofErr w:type="gramEnd"/>
+      <w:r>
+        <w:rPr>
+          <w:iCs/>
+          <w:sz w:val="24"/>
+          <w:szCs w:val="24"/>
+        </w:rPr>
+        <w:t xml:space="preserve"> these models haven't been used in medical imaging so far and the study of </w:t>
       </w:r>
       <w:proofErr w:type="spellStart"/>
       <w:r>
@@ -13981,7 +14015,87 @@
           <w:sz w:val="24"/>
           <w:szCs w:val="24"/>
         </w:rPr>
-        <w:t xml:space="preserve">This research is motivated by practical need and academic opportunity. This ratio of approximately 1 radiologist per 200,000 population, combined with the fact that most chest X-rays in district hospitals are either not evaluated or must be waited for several days before they can be discussed via telemedicine, results in the majority of patients not receiving timely consultations with a radiologist (Adhikari et al., 2025). However, this is where AI-assisted reporting can help: If the output is in a language that clinicians can use. While Bangla is the native language of more than 170 million people across Bangladesh and several hundred million in the Indian state of West Bengal and in the diaspora, it continues to under-represented in medical AI research. In addition to its clinical relevance, there is an academic gap that needs to be filled – while a number of European languages have been the subject of research in low-resource medical NLG, medical applications in South Asian languages have not been investigated at all in the field of radiology. Language </w:t>
+        <w:t xml:space="preserve">This research is motivated by practical </w:t>
+      </w:r>
+      <w:proofErr w:type="gramStart"/>
+      <w:r>
+        <w:rPr>
+          <w:b w:val="0"/>
+          <w:bCs w:val="0"/>
+          <w:sz w:val="24"/>
+          <w:szCs w:val="24"/>
+        </w:rPr>
+        <w:t>need</w:t>
+      </w:r>
+      <w:proofErr w:type="gramEnd"/>
+      <w:r>
+        <w:rPr>
+          <w:b w:val="0"/>
+          <w:bCs w:val="0"/>
+          <w:sz w:val="24"/>
+          <w:szCs w:val="24"/>
+        </w:rPr>
+        <w:t xml:space="preserve"> and academic </w:t>
+      </w:r>
+      <w:proofErr w:type="gramStart"/>
+      <w:r>
+        <w:rPr>
+          <w:b w:val="0"/>
+          <w:bCs w:val="0"/>
+          <w:sz w:val="24"/>
+          <w:szCs w:val="24"/>
+        </w:rPr>
+        <w:t>opportunity</w:t>
+      </w:r>
+      <w:proofErr w:type="gramEnd"/>
+      <w:r>
+        <w:rPr>
+          <w:b w:val="0"/>
+          <w:bCs w:val="0"/>
+          <w:sz w:val="24"/>
+          <w:szCs w:val="24"/>
+        </w:rPr>
+        <w:t xml:space="preserve">. This ratio of approximately 1 radiologist per 200,000 population, combined with the fact that most chest X-rays in district hospitals are either not evaluated or must be waited for several days before they can be discussed via telemedicine, results in </w:t>
+      </w:r>
+      <w:proofErr w:type="gramStart"/>
+      <w:r>
+        <w:rPr>
+          <w:b w:val="0"/>
+          <w:bCs w:val="0"/>
+          <w:sz w:val="24"/>
+          <w:szCs w:val="24"/>
+        </w:rPr>
+        <w:t>the majority of</w:t>
+      </w:r>
+      <w:proofErr w:type="gramEnd"/>
+      <w:r>
+        <w:rPr>
+          <w:b w:val="0"/>
+          <w:bCs w:val="0"/>
+          <w:sz w:val="24"/>
+          <w:szCs w:val="24"/>
+        </w:rPr>
+        <w:t xml:space="preserve"> patients not receiving timely consultations with a radiologist (Adhikari et al., 2025). However, this is where AI-assisted reporting can help: If the output is in a language that clinicians can use. While Bangla is the native language of more than 170 million people across Bangladesh and several hundred million in the Indian state of West Bengal and in the diaspora, it continues to under-represented in medical AI research. In addition to its clinical relevance, there is an academic gap that needs to be filled – while </w:t>
+      </w:r>
+      <w:proofErr w:type="gramStart"/>
+      <w:r>
+        <w:rPr>
+          <w:b w:val="0"/>
+          <w:bCs w:val="0"/>
+          <w:sz w:val="24"/>
+          <w:szCs w:val="24"/>
+        </w:rPr>
+        <w:t>a number of</w:t>
+      </w:r>
+      <w:proofErr w:type="gramEnd"/>
+      <w:r>
+        <w:rPr>
+          <w:b w:val="0"/>
+          <w:bCs w:val="0"/>
+          <w:sz w:val="24"/>
+          <w:szCs w:val="24"/>
+        </w:rPr>
+        <w:t xml:space="preserve"> European languages have been the subject of research in low-resource medical NLG, medical applications in South Asian languages have not been investigated at all in the field of radiology. Language </w:t>
       </w:r>
       <w:r>
         <w:rPr>
@@ -14053,7 +14167,27 @@
           <w:sz w:val="24"/>
           <w:szCs w:val="24"/>
         </w:rPr>
-        <w:t xml:space="preserve">The research goes hand in hand with a series of six linked phases. The study starts by an in-depth literature review on vision-language models for radiology report generation, Bangla NLP, multilingual clinical NLP, and AI usage in low-resource regions that collectively form the specific gap addressed in this study. The second phase deals with the preparation of the dataset, including the collection of the Indiana University Chest X-ray dataset and filtering of valid image-report pairs to create a frontal view only dataset, and creating training, validation, and test splits. The third phase involves designing and implementing the model architecture, such as the design of the cross-attention projector based on the anatomy, the vision encoder being a RAD-DINO model, and the fine-tuning of the Phi-3.5 Mini language model decoder using </w:t>
+        <w:t xml:space="preserve">The research goes hand in hand with a series of six linked phases. The study starts </w:t>
+      </w:r>
+      <w:proofErr w:type="gramStart"/>
+      <w:r>
+        <w:rPr>
+          <w:b w:val="0"/>
+          <w:bCs w:val="0"/>
+          <w:sz w:val="24"/>
+          <w:szCs w:val="24"/>
+        </w:rPr>
+        <w:t>by</w:t>
+      </w:r>
+      <w:proofErr w:type="gramEnd"/>
+      <w:r>
+        <w:rPr>
+          <w:b w:val="0"/>
+          <w:bCs w:val="0"/>
+          <w:sz w:val="24"/>
+          <w:szCs w:val="24"/>
+        </w:rPr>
+        <w:t xml:space="preserve"> an in-depth literature review on vision-language models for radiology report generation, Bangla NLP, multilingual clinical NLP, and AI usage in low-resource regions that collectively form the specific gap addressed in this study. The second phase deals with the preparation of the dataset, including the collection of the Indiana University Chest X-ray dataset and filtering of valid image-report pairs to create a frontal view only dataset, and creating training, validation, and test splits. The third phase involves designing and implementing the model architecture, such as the design of the cross-attention projector based on the anatomy, the vision encoder being a RAD-DINO model, and the fine-tuning of the Phi-3.5 Mini language model decoder using </w:t>
       </w:r>
       <w:proofErr w:type="spellStart"/>
       <w:r>
@@ -14125,7 +14259,27 @@
           <w:sz w:val="24"/>
           <w:szCs w:val="24"/>
         </w:rPr>
-        <w:t xml:space="preserve">This research is significant on both practical and academic dimensions. On a practical level, it shows an AI system capable of producing clinically useful chest X-ray reports in Bangla can be developed and deployed on consumer-grade hardware (a 8.5 GB VRAM </w:t>
+        <w:t>This research is significant on both practical and academic dimensions. On a practical level, it shows an AI system capable of producing clinically useful chest X-ray reports in Bangla can be developed and deployed on consumer-grade hardware (</w:t>
+      </w:r>
+      <w:proofErr w:type="gramStart"/>
+      <w:r>
+        <w:rPr>
+          <w:b w:val="0"/>
+          <w:bCs w:val="0"/>
+          <w:sz w:val="24"/>
+          <w:szCs w:val="24"/>
+        </w:rPr>
+        <w:t>a</w:t>
+      </w:r>
+      <w:proofErr w:type="gramEnd"/>
+      <w:r>
+        <w:rPr>
+          <w:b w:val="0"/>
+          <w:bCs w:val="0"/>
+          <w:sz w:val="24"/>
+          <w:szCs w:val="24"/>
+        </w:rPr>
+        <w:t xml:space="preserve"> 8 GB VRAM </w:t>
       </w:r>
       <w:proofErr w:type="spellStart"/>
       <w:r>
@@ -14277,7 +14431,15 @@
       </w:r>
       <w:proofErr w:type="spellEnd"/>
       <w:r>
-        <w:t xml:space="preserve"> training strategy, and the glossary-augmented translation pipeline are explained in Chapter 3. Chapter 4 discusses the environment in which the implementation took place, the preparation of the data set, and the technical problems faced in the development and how they were overcome. Experimental results are presented in Chapter 5, including quantitative results with NLP and clinical metrics, ablation studies with baseline alternatives to the proposed projector, and qualitative analysis of the reports generated. The findings are discussed in the context of the research questions, limitations of the present study and future research directions are given in chapter 6. Lastly, Chapter 7 summarizes the main results and their implications.</w:t>
+        <w:t xml:space="preserve"> training strategy, and the glossary-augmented translation pipeline are explained in Chapter 3. Chapter 4 discusses the environment in which the implementation took place, the preparation of the data set, and the technical problems faced in the development and how they were overcome. Experimental results are presented in Chapter 5, including quantitative results with NLP and clinical metrics, ablation studies with baseline alternatives to the proposed projector, and qualitative analysis of the reports generated. The findings are discussed in the context of the research </w:t>
+      </w:r>
+      <w:proofErr w:type="gramStart"/>
+      <w:r>
+        <w:t>questions,</w:t>
+      </w:r>
+      <w:proofErr w:type="gramEnd"/>
+      <w:r>
+        <w:t xml:space="preserve"> limitations of the present study and future research directions are given in chapter 6. Lastly, Chapter 7 summarizes the main results and their implications.</w:t>
       </w:r>
     </w:p>
     <w:p>
@@ -14343,7 +14505,47 @@
           <w:sz w:val="24"/>
           <w:szCs w:val="24"/>
         </w:rPr>
-        <w:t>, a two-stage AI system to generate chest X-ray radiology report in both English and Bangla. The central issue – the lack of automated radiology reporting in Bangla in one nation where the number of radiologists is very low – was clearly outlined, grounded in the existing literature and linked to a series of specific, measurable research questions. The research questions direct the experimental design, the contributions clearly explain what is new in this research, and the thesis organization provides an overview of how each chapter builds towards a complete and measurable system. The next chapter explores the current research literature in depth to form the theoretical and empirical base for this research work.</w:t>
+        <w:t xml:space="preserve">, a two-stage AI system to generate chest X-ray radiology report in both English and Bangla. The central </w:t>
+      </w:r>
+      <w:proofErr w:type="gramStart"/>
+      <w:r>
+        <w:rPr>
+          <w:b w:val="0"/>
+          <w:bCs w:val="0"/>
+          <w:sz w:val="24"/>
+          <w:szCs w:val="24"/>
+        </w:rPr>
+        <w:t>issue</w:t>
+      </w:r>
+      <w:proofErr w:type="gramEnd"/>
+      <w:r>
+        <w:rPr>
+          <w:b w:val="0"/>
+          <w:bCs w:val="0"/>
+          <w:sz w:val="24"/>
+          <w:szCs w:val="24"/>
+        </w:rPr>
+        <w:t xml:space="preserve"> the lack of automated radiology reporting in Bangla in one nation where the number of radiologists is very </w:t>
+      </w:r>
+      <w:proofErr w:type="gramStart"/>
+      <w:r>
+        <w:rPr>
+          <w:b w:val="0"/>
+          <w:bCs w:val="0"/>
+          <w:sz w:val="24"/>
+          <w:szCs w:val="24"/>
+        </w:rPr>
+        <w:t>low</w:t>
+      </w:r>
+      <w:proofErr w:type="gramEnd"/>
+      <w:r>
+        <w:rPr>
+          <w:b w:val="0"/>
+          <w:bCs w:val="0"/>
+          <w:sz w:val="24"/>
+          <w:szCs w:val="24"/>
+        </w:rPr>
+        <w:t xml:space="preserve"> was clearly outlined, grounded in the existing literature and linked to a series of specific, measurable research questions. The research questions direct the experimental design, the contributions clearly explain what is new in this research, and the thesis organization provides an overview of how each chapter builds towards a complete and measurable system. The next chapter explores the current research literature in depth to form the theoretical and empirical base for this research work.</w:t>
       </w:r>
     </w:p>
     <w:p>
@@ -14717,7 +14919,15 @@
       </w:r>
       <w:proofErr w:type="spellEnd"/>
       <w:r>
-        <w:t xml:space="preserve"> (2026) conducted the most recent survey of this trajectory, including 51 deep learning studies from 2018 to September 2025, and also found the same dominant dataset, MIMIC-CXR, and the same clinical evaluation and multi-lingual shortcomings. Tran et al. (2026) also reviewed 14 model evaluations from 2021 to 2024, identifying the same dominant dataset, MIMIC-CXR, and the same clinical evaluation and multi-lingual shortcomings. Within the foundational architectures, </w:t>
+        <w:t xml:space="preserve"> (2026) conducted the most recent survey of this trajectory, including 51 deep learning studies from 2018 to September 2025, </w:t>
+      </w:r>
+      <w:proofErr w:type="gramStart"/>
+      <w:r>
+        <w:t>and also</w:t>
+      </w:r>
+      <w:proofErr w:type="gramEnd"/>
+      <w:r>
+        <w:t xml:space="preserve"> found the same dominant dataset, MIMIC-CXR, and the same clinical evaluation and multi-lingual shortcomings. Tran et al. (2026) also reviewed 14 model evaluations from 2021 to 2024, identifying the same dominant dataset, MIMIC-CXR, and the same clinical evaluation and multi-lingual shortcomings. Within the foundational architectures, </w:t>
       </w:r>
       <w:proofErr w:type="spellStart"/>
       <w:r>
@@ -14725,7 +14935,7 @@
       </w:r>
       <w:proofErr w:type="spellEnd"/>
       <w:r>
-        <w:t xml:space="preserve"> ( Chen et al., 2024) has set a benchmark design paradigm that uses an image encoder (</w:t>
+        <w:t xml:space="preserve"> (Chen et al., 2024) has set a benchmark design paradigm that uses an image encoder (</w:t>
       </w:r>
       <w:proofErr w:type="spellStart"/>
       <w:r>
@@ -14749,11 +14959,11 @@
       </w:r>
       <w:proofErr w:type="spellEnd"/>
       <w:r>
-        <w:t xml:space="preserve"> and </w:t>
+        <w:t xml:space="preserve"> and established strong </w:t>
       </w:r>
       <w:r>
         <w:lastRenderedPageBreak/>
-        <w:t xml:space="preserve">established strong baselines for each view classification, VQA and report generation. A similar design approach forms the basis of </w:t>
+        <w:t xml:space="preserve">baselines for each view classification, VQA and report generation. A similar design approach forms the basis of </w:t>
       </w:r>
       <w:proofErr w:type="spellStart"/>
       <w:r>
@@ -14833,7 +15043,15 @@
       </w:r>
       <w:proofErr w:type="spellEnd"/>
       <w:r>
-        <w:t xml:space="preserve"> (Pellegrini et al., 2025) is an extension of the report generation paradigm to interactive, dialogue-based clinical support. By leveraging a BERT-based alignment module and fine-tuning the Vicuna-7B with </w:t>
+        <w:t xml:space="preserve"> (Pellegrini et al., 2025) is an extension of the report generation paradigm to interactive, dialogue-based clinical support. By leveraging a BERT-based alignment module and fine-tuning </w:t>
+      </w:r>
+      <w:proofErr w:type="gramStart"/>
+      <w:r>
+        <w:t>the Vicuna</w:t>
+      </w:r>
+      <w:proofErr w:type="gramEnd"/>
+      <w:r>
+        <w:t xml:space="preserve">-7B with </w:t>
       </w:r>
       <w:proofErr w:type="spellStart"/>
       <w:r>
@@ -14857,7 +15075,15 @@
       </w:r>
       <w:proofErr w:type="spellEnd"/>
       <w:r>
-        <w:t xml:space="preserve"> with a clinical efficacy F1 score of 39.7 on MIMIC-CXR and is able to correct, summarize, and generate visual question answering for reports using a 580,000-sample instruction dataset. There is no limitation included in the model that acknowledges the non-English reporting of evaluations. The approach of </w:t>
+        <w:t xml:space="preserve"> with a clinical efficacy F1 score of 39.7 on MIMIC-CXR and </w:t>
+      </w:r>
+      <w:proofErr w:type="gramStart"/>
+      <w:r>
+        <w:t>is able to</w:t>
+      </w:r>
+      <w:proofErr w:type="gramEnd"/>
+      <w:r>
+        <w:t xml:space="preserve"> correct, summarize, and generate visual question answering for reports using a 580,000-sample instruction dataset. There is no limitation included in the model that acknowledges the non-English reporting of evaluations. The approach of </w:t>
       </w:r>
       <w:proofErr w:type="spellStart"/>
       <w:r>
@@ -14897,11 +15123,19 @@
       </w:r>
       <w:proofErr w:type="spellEnd"/>
       <w:r>
-        <w:t xml:space="preserve"> fine-tuning strategy and integration with prior clinical knowledge can lead to a METEOR score </w:t>
+        <w:t xml:space="preserve"> fine-tuning strategy and integration with prior clinical knowledge can lead to a METEOR score of 0.570 on IU X-ray, which is more than double </w:t>
       </w:r>
       <w:r>
         <w:lastRenderedPageBreak/>
-        <w:t xml:space="preserve">of 0.570 on IU X-ray, which is more than double the best competitor. Hartsock and Rasool (2024) offer a more broad architectural overview of 16 medical VLMs, discussing single-stream and dual-stream architectures, training methods (including contrastive learning and RLHF), and evaluation techniques, highlighting the key challenges of the field as hallucination, catastrophic forgetting, and the lack of clinical evaluation metrics. While the survey by Mamdouh et al. (2025) on Bioengineering provides a structured comparison of 38 papers by different methods, including transformer-based, LLM/VLM-based and graph-based methods, the authors have identified RADAR as the best-performing model for the MIMIC-CXR dataset for 2025, with BLEU-1 of 0.509 and METEOR of 0.450 respectively, and explicitly note that there is no report generation literature for non-English and low-resource languages. In this thesis, the </w:t>
+        <w:t xml:space="preserve">the best competitor. Hartsock and Rasool (2024) offer a </w:t>
+      </w:r>
+      <w:proofErr w:type="gramStart"/>
+      <w:r>
+        <w:t>more broad</w:t>
+      </w:r>
+      <w:proofErr w:type="gramEnd"/>
+      <w:r>
+        <w:t xml:space="preserve"> architectural overview of 16 medical VLMs, discussing single-stream and dual-stream architectures, training methods (including contrastive learning and RLHF), and evaluation techniques, highlighting the key challenges of the field as hallucination, catastrophic forgetting, and the lack of clinical evaluation metrics. While the survey by Mamdouh et al. (2025) on Bioengineering provides a structured comparison of 38 papers by different methods, including transformer-based, LLM/VLM-based and graph-based methods, the authors have identified RADAR as the best-performing model for the MIMIC-CXR dataset for 2025, with BLEU-1 of 0.509 and METEOR of 0.450 respectively, and explicitly note that there is no report generation literature for non-English and low-resource languages. In this thesis, the </w:t>
       </w:r>
       <w:proofErr w:type="spellStart"/>
       <w:r>
@@ -14979,7 +15213,15 @@
       </w:r>
       <w:proofErr w:type="spellEnd"/>
       <w:r>
-        <w:t xml:space="preserve"> (Bhattacharjee et al., 2022) laid the groundwork by pretraining an ELECTRA-based encoder on 27.5 GB of Bangla web text, where the researchers explicitly pointed out that the text used for pretraining does not include biomedical or clinical text. Bhattacharjee et al., 2023 built upon this by making BanglaT5 (247M parameters) based on the Bangla2B+ corpus, and creating the </w:t>
+        <w:t xml:space="preserve"> (Bhattacharjee et al., 2022) laid the groundwork by pretraining an ELECTRA-based encoder on 27.5 GB of Bangla web text, where the researchers explicitly pointed out that the text used for pretraining does not include biomedical or clinical text. Bhattacharjee et al., 2023 built upon this by making BanglaT5 (247M parameters) based on the Bangla2B+ </w:t>
+      </w:r>
+      <w:proofErr w:type="gramStart"/>
+      <w:r>
+        <w:t>corpus, and</w:t>
+      </w:r>
+      <w:proofErr w:type="gramEnd"/>
+      <w:r>
+        <w:t xml:space="preserve"> creating the </w:t>
       </w:r>
       <w:proofErr w:type="spellStart"/>
       <w:r>
@@ -15023,7 +15265,15 @@
       </w:r>
       <w:proofErr w:type="spellEnd"/>
       <w:r>
-        <w:t xml:space="preserve"> (Raihan &amp; Zampieri, 2025) has recently introduced the first properly documented family of Bangla specific (1B and 9B) LLMs that were continually pre-trained on 10M token educational corpus and fully fine-tuned on 100K instruction-response pairs, outperforming all previous Bangla LLMs by 30–55 percentage points across six benchmarks and even being better than GPT-3.5 on most tasks, but still they are entirely in general-purpose domain with no medical applications.</w:t>
+        <w:t xml:space="preserve"> (Raihan &amp; Zampieri, 2025) has recently introduced the first properly documented family of Bangla specific (1B and 9B) LLMs that were continually pre-trained on 10M token educational corpus and fully fine-tuned on 100K instruction-response pairs, outperforming all previous Bangla LLMs by 30–55 percentage points across six benchmarks and even being better than GPT-3.5 on most tasks, but </w:t>
+      </w:r>
+      <w:proofErr w:type="gramStart"/>
+      <w:r>
+        <w:t>still</w:t>
+      </w:r>
+      <w:proofErr w:type="gramEnd"/>
+      <w:r>
+        <w:t xml:space="preserve"> they are entirely in general-purpose domain with no medical applications.</w:t>
       </w:r>
     </w:p>
     <w:p>
@@ -15053,7 +15303,15 @@
         <w:jc w:val="both"/>
       </w:pPr>
       <w:r>
-        <w:t>The translation module of this pipeline builds upon a research foundation of multilingual clinical NLP that not only tackles the technical issues of medical domain machine translation (MDMT), but also the broader issue of translating medical AI into low-resource languages. Han et al. (2024) compare three multilingual models to fine-tune a translation model with only 250,000 clean bilingual sentence pairs to translate clinical texts from English to Spanish and vice versa, and find that a fine-tuned small model (Clinical-Marian) outperforms much larger models such as NLLB-distilled across most metrics and achieves the best human evaluation score (HOPE score of 0.80) score. Luo et al. (2024) provide an analysis of multilingual BERT domain-adaptive pretraining for clinical NER and HIV screening classification tasks on Dutch, Romanian, and Spanish, demonstrating that, for the tasks analyzed, the clinical domain adaptation strategy outperform the general biomedical domain by statistically significant margins, especially when the target language is similar to the domain from which the base model was trained. The L2M3 system (</w:t>
+        <w:t xml:space="preserve">The translation module of this pipeline builds upon a research foundation of multilingual clinical NLP that not only tackles the technical issues of medical domain machine translation (MDMT), but also the broader issue of translating medical AI into low-resource languages. Han et al. (2024) compare three multilingual models to fine-tune a translation model with only 250,000 clean bilingual sentence pairs to translate clinical texts from English to Spanish and </w:t>
+      </w:r>
+      <w:proofErr w:type="gramStart"/>
+      <w:r>
+        <w:t>vice versa, and</w:t>
+      </w:r>
+      <w:proofErr w:type="gramEnd"/>
+      <w:r>
+        <w:t xml:space="preserve"> find that a fine-tuned small model (Clinical-Marian) outperforms much larger models such as NLLB-distilled across most metrics and achieves the best human evaluation score (HOPE score of 0.80) score. Luo et al. (2024) provide an analysis of multilingual BERT domain-adaptive pretraining for clinical NER and HIV screening classification tasks on Dutch, Romanian, and Spanish, demonstrating that, for the tasks analyzed, the clinical domain adaptation strategy outperform the general biomedical domain by statistically significant margins, especially when the target language is similar to the domain from which the base model was trained. The L2M3 system (</w:t>
       </w:r>
       <w:proofErr w:type="spellStart"/>
       <w:r>
@@ -15184,7 +15442,15 @@
       </w:r>
       <w:proofErr w:type="spellEnd"/>
       <w:r>
-        <w:t xml:space="preserve">, it is pointed out by the authors of the survey of Mamdouh et al. (2025) as a specific future direction, and no work has been done. This is the main deficiency. The second aspect of the issue is the evaluation infrastructure. If a researcher wanted to develop Bangla radiology report generation system, there is no benchmark for them to evaluate the system. </w:t>
+        <w:t xml:space="preserve">, it is pointed out by the authors of the survey of Mamdouh et al. (2025) as a specific future direction, and no work has been done. This is the main deficiency. The second aspect of the issue is the evaluation infrastructure. If a researcher wanted to develop Bangla radiology report generation system, there </w:t>
+      </w:r>
+      <w:proofErr w:type="gramStart"/>
+      <w:r>
+        <w:t>is</w:t>
+      </w:r>
+      <w:proofErr w:type="gramEnd"/>
+      <w:r>
+        <w:t xml:space="preserve"> no benchmark for them to evaluate the system. </w:t>
       </w:r>
       <w:proofErr w:type="spellStart"/>
       <w:r>
@@ -15203,10 +15469,12 @@
         <w:t xml:space="preserve">-Eval and Abrar et al. (2024) which was done specifically in the context of health. No annotated Bangla radiology dataset, no reference report set and no protocol for measuring Bangla medical NLG quality. The third dimension is the architectural challenge of effectively embedding language model generation into radiological visual characteristics under compute </w:t>
       </w:r>
       <w:proofErr w:type="spellStart"/>
+      <w:proofErr w:type="gramStart"/>
       <w:r>
         <w:t>constraints.The</w:t>
       </w:r>
       <w:proofErr w:type="spellEnd"/>
+      <w:proofErr w:type="gramEnd"/>
       <w:r>
         <w:t xml:space="preserve"> third dimension is the architectural problem of using limited compute to effectively embed language model generation in radiological visual characteristics. Lian et al. (2024) have found that parameter-efficient fine-tuning is the right approach for small data sets. Rad-DINO is the best radiology vision encoder available and has been validated by MAIRA-2. But the design of the projector architecture from the vision encoder to the language model is still an open question in resource-constrained environments. The more complex the architecture, such as the four-layer MLP in MAIRA-2, the more extensive the training data must be, and simple MLP pooling which is used in </w:t>
       </w:r>
@@ -15216,7 +15484,15 @@
       </w:r>
       <w:proofErr w:type="spellEnd"/>
       <w:r>
-        <w:t xml:space="preserve"> might lose spatial visual information into a single embedding that cannot be used to guide multi-finding generation. While this method is advantageous in the medical imaging context, a novel tradeoff exists with a cross-attention mechanism based on learned region queries, similar to the BLIP-2 Q-Former network, but modified to the task of radiology with a small, fixed number of anatomy-representative tokens, which is a method that has not been tested on the IU X-ray dataset under compute constraints typical of low-resource deployment. The fourth dimension is the pipeline itself. Neither L2M3 nor Han et al. (2024) test the pipeline with medical languages, of which radiology reports are a subset, nor do both test Bangla; both show that the two-stage pipeline is practically viable for low resource languages. The clinical terms are also another challenge for the translation of Bangla as many such terms do not have Bangla equivalents and they are either transliterated or code-switched into English in clinical communication, which was observed by </w:t>
+        <w:t xml:space="preserve"> might lose spatial visual information into a single embedding that cannot be used to guide multi-finding generation. While this method is advantageous in the medical imaging context, a novel tradeoff exists with a cross-attention mechanism based on learned region queries, similar to the BLIP-2 Q-Former </w:t>
+      </w:r>
+      <w:proofErr w:type="gramStart"/>
+      <w:r>
+        <w:t>network, but</w:t>
+      </w:r>
+      <w:proofErr w:type="gramEnd"/>
+      <w:r>
+        <w:t xml:space="preserve"> modified to the task of radiology with a small, fixed number of anatomy-representative tokens, which is a method that has not been tested on the IU X-ray dataset under compute constraints typical of low-resource deployment. The fourth dimension is the pipeline itself. Neither L2M3 nor Han et al. (2024) test the pipeline with medical languages, of which radiology reports are a subset, nor do both test Bangla; both show that the two-stage pipeline is practically viable for low resource languages. The clinical terms are also another challenge for the translation of Bangla as many such terms do not have Bangla equivalents and they are either transliterated or code-switched into English in clinical communication, which was observed by </w:t>
       </w:r>
       <w:proofErr w:type="spellStart"/>
       <w:r>
@@ -15645,7 +15921,15 @@
       </w:r>
       <w:proofErr w:type="spellEnd"/>
       <w:r>
-        <w:t xml:space="preserve"> system. After the feasibility analysis to determine if the approach is feasible in the resource limitations of this research, the chapter progresses through the functional and non-functional requirements of the system, the two-phase research process from vision to English text and English to Bangla, the full system architecture, and implementation and training decisions to create a final model. The main architectural challenge discussed here is how to develop a clinically viable, language-specific radiology report generation pipeline, on top of an open source set of model components, a publicly accessible but still reasonably sized dataset, and a consumer-grade GPU, without simultaneously making a novel, verifiable architectural contribution.</w:t>
+        <w:t xml:space="preserve"> system. After the feasibility analysis to determine if the approach is feasible in the resource limitations of this research, the chapter progresses through the functional and non-functional requirements of the system, the two-phase research process from vision to English text and English to Bangla, the full system architecture, and implementation and training decisions to create a final model. The main architectural challenge discussed here is how to develop a clinically viable, language-specific radiology report generation pipeline, on top of an </w:t>
+      </w:r>
+      <w:proofErr w:type="gramStart"/>
+      <w:r>
+        <w:t>open source</w:t>
+      </w:r>
+      <w:proofErr w:type="gramEnd"/>
+      <w:r>
+        <w:t xml:space="preserve"> set of model components, a publicly accessible but still reasonably sized dataset, and a consumer-grade GPU, without simultaneously making a novel, verifiable architectural contribution.</w:t>
       </w:r>
     </w:p>
     <w:p>
@@ -15686,10 +15970,12 @@
         <w:t>In a technical sense, the proposed system is technically achievable, with the available resources. The entire pipeline is developed for NVIDIA GeForce RTX 5050 Laptop GPU with 8GB VRAM, which is a limitation that prevents large models from being trained from scratch, but can support the fine-tuning of large models up to 4 billion parameters using 4-bit quantized models. The main training resource, the IU X-ray dataset, consists of 7,470 chest X-ray images, accompanied by radiology reports, and is publicly available in Open-</w:t>
       </w:r>
       <w:proofErr w:type="spellStart"/>
+      <w:proofErr w:type="gramStart"/>
       <w:r>
         <w:t>i.The</w:t>
       </w:r>
       <w:proofErr w:type="spellEnd"/>
+      <w:proofErr w:type="gramEnd"/>
       <w:r>
         <w:t xml:space="preserve"> IU X-ray dataset is the primary training resource which contains 7,470 chest X-ray images with associated radiology reports, adequate to fine-tune a vision-language model for supervised learning. The weights for all the model components, RAD-DINO, Phi-3.5 Mini, and NLLB-200 are provided as open source pretrained weights and do not need commercial licenses from </w:t>
       </w:r>
@@ -15719,7 +16005,15 @@
       </w:r>
       <w:proofErr w:type="spellEnd"/>
       <w:r>
-        <w:t xml:space="preserve"> and 4-bit quantization specifically, it reduces VRAM demand to the point of being possible to run on commodity hardware as demonstrated by Lian et al. (2024) and shown to be effective by other researchers at institutions in Bangladesh and other low-resource environments, avoiding the need for dedicated compute facilities. From an operational perspective, the two-stage pipeline enables each of the stages to be modularly developed, tested and evaluated to minimize risk in implementation. The English output from Stage 1 is also available to use as a backup in case the translation quality of a report is not good enough for Stage 2. The system does not need internet connectivity at inference time, thus it can be deployed in the offline-first setting which is made essential by Adhikari et al. (2025) in Bangladesh's district hospital context.</w:t>
+        <w:t xml:space="preserve"> and 4-bit quantization specifically, it reduces VRAM demand to the point of being possible to run on commodity hardware as demonstrated by Lian et al. (2024) and shown to be effective by other researchers at institutions in Bangladesh and other low-resource environments, avoiding the need for dedicated compute facilities. From an operational perspective, the two-stage pipeline enables each of the stages to be modularly developed, tested and evaluated to minimize risk in implementation. The English output from Stage 1 is also available to use as a backup in case the translation quality of a report is not good enough for Stage 2. The system does not need internet connectivity at inference </w:t>
+      </w:r>
+      <w:proofErr w:type="gramStart"/>
+      <w:r>
+        <w:t>time,</w:t>
+      </w:r>
+      <w:proofErr w:type="gramEnd"/>
+      <w:r>
+        <w:t xml:space="preserve"> thus it can be deployed in the offline-first setting which is made essential by Adhikari et al. (2025) in Bangladesh's district hospital context.</w:t>
       </w:r>
     </w:p>
     <w:p>
@@ -15778,7 +16072,39 @@
       </w:r>
       <w:proofErr w:type="spellEnd"/>
       <w:r>
-        <w:t>++. For each of the twelve clinical categories, precision, recall, and F1 scores should be computed per label. There are also the non-functional requirements that are important in this deployment context. All of the training pipeline has to be contained in 8.5 GB of VRAM. The time required to have the inferences completed should not exceed the time of reading the image and should not exceed 30 seconds per report in the same hardware. The system should not have to be connected to the Internet during inference. It is recommended that the code base is written in reproducible Jupyter notebooks allowing to rerun the entire pipeline from scratch. The report should be generated in the same prompt template as in training (Findings followed by Impression), and be written in English. The output of the translation should be in Bangla script using Unicode characters, which can be checked by looking through it, without requiring any special medical expertise.</w:t>
+        <w:t xml:space="preserve">++. For each of the twelve clinical categories, precision, recall, and F1 scores should be computed per label. There are also the non-functional requirements that are important in this deployment context. </w:t>
+      </w:r>
+      <w:proofErr w:type="gramStart"/>
+      <w:r>
+        <w:t>All of</w:t>
+      </w:r>
+      <w:proofErr w:type="gramEnd"/>
+      <w:r>
+        <w:t xml:space="preserve"> the training pipeline </w:t>
+      </w:r>
+      <w:proofErr w:type="gramStart"/>
+      <w:r>
+        <w:t>has to</w:t>
+      </w:r>
+      <w:proofErr w:type="gramEnd"/>
+      <w:r>
+        <w:t xml:space="preserve"> be contained in 8.5 GB of VRAM. The time required to have the inferences completed should not exceed the time of reading the image and should not exceed 30 seconds per report in the same hardware. The system should not have to be connected to the Internet during inference. It is recommended that the code base is written in reproducible Jupyter notebooks allowing </w:t>
+      </w:r>
+      <w:proofErr w:type="gramStart"/>
+      <w:r>
+        <w:t>to rerun the entire pipeline</w:t>
+      </w:r>
+      <w:proofErr w:type="gramEnd"/>
+      <w:r>
+        <w:t xml:space="preserve"> from scratch. The report should be generated in the same prompt template as in training (Findings followed by Impression</w:t>
+      </w:r>
+      <w:proofErr w:type="gramStart"/>
+      <w:r>
+        <w:t>), and</w:t>
+      </w:r>
+      <w:proofErr w:type="gramEnd"/>
+      <w:r>
+        <w:t xml:space="preserve"> be written in English. The output of the translation should be in Bangla script using Unicode characters, which can be checked by looking through it, without requiring any special medical expertise.</w:t>
       </w:r>
     </w:p>
     <w:p>
@@ -15839,9 +16165,30 @@
           <w:sz w:val="24"/>
           <w:szCs w:val="24"/>
         </w:rPr>
-        <w:t xml:space="preserve"> is a two-stage process that breaks down the problem of generating multilingual radiology reports into two manageable parts which are rooted in well-documented solutions from the literature. In the first step, a vision-language model is trained to produce structured radiology reports from chest X-ray images, while using natural language to describe the image </w:t>
+        <w:t xml:space="preserve"> is a two-stage process that breaks down the problem of generating multilingual radiology reports into two manageable parts which are rooted in well-documented solutions from </w:t>
+      </w:r>
+      <w:proofErr w:type="gramStart"/>
+      <w:r>
+        <w:rPr>
+          <w:b w:val="0"/>
+          <w:bCs w:val="0"/>
+          <w:sz w:val="24"/>
+          <w:szCs w:val="24"/>
+        </w:rPr>
+        <w:t>the literature</w:t>
+      </w:r>
+      <w:proofErr w:type="gramEnd"/>
+      <w:r>
+        <w:rPr>
+          <w:b w:val="0"/>
+          <w:bCs w:val="0"/>
+          <w:sz w:val="24"/>
+          <w:szCs w:val="24"/>
+        </w:rPr>
+        <w:t xml:space="preserve">. In the first step, a vision-language model is trained to produce structured radiology reports from chest X-ray images, while using natural language to describe the image </w:t>
       </w:r>
       <w:proofErr w:type="spellStart"/>
+      <w:proofErr w:type="gramStart"/>
       <w:r>
         <w:rPr>
           <w:b w:val="0"/>
@@ -15852,14 +16199,35 @@
         <w:t>content.The</w:t>
       </w:r>
       <w:proofErr w:type="spellEnd"/>
-      <w:r>
-        <w:rPr>
-          <w:b w:val="0"/>
-          <w:bCs w:val="0"/>
-          <w:sz w:val="24"/>
-          <w:szCs w:val="24"/>
-        </w:rPr>
-        <w:t xml:space="preserve"> first step is to train a vision-language model that produces a structured radiology report from the chest X-ray image while using natural language to describe the image content. The second step is the use of a pretrained multilingual neural machine translation system to translate English reports into Bangla. This approach of two stages is preferred over an end-to-end Bangla generation for three reasons. First, the amount of English chest X-ray training data is significantly larger and more varied than any Bangla-specific training data and, by separating the vision-to-language step from the translation step, it can both be optimized using the data best suited to it. Second, English production in stage 1 can be directly assessed against a set of standards and it is easy to ensure that the vision-language model is functioning properly before assessing the translation phase. Third, the modular architecture allows for the upgrading of the translation stage independently, as the translation model for Bangla is improved, without retraining the vision-language core. The method is similar to the one used by Han et al. (2024) and </w:t>
+      <w:proofErr w:type="gramEnd"/>
+      <w:r>
+        <w:rPr>
+          <w:b w:val="0"/>
+          <w:bCs w:val="0"/>
+          <w:sz w:val="24"/>
+          <w:szCs w:val="24"/>
+        </w:rPr>
+        <w:t xml:space="preserve"> first step is to train a vision-language model that produces a structured radiology report from the chest X-ray image while using natural language to describe the image content. The second step is the use of a pretrained multilingual neural machine translation system to translate English reports into Bangla. This approach of two stages is preferred over an end-to-end Bangla generation for three reasons. First, the amount of English chest X-ray training data is significantly larger and more varied than any Bangla-specific training data and, by separating the vision-to-language step from the translation step, it can both be optimized using the data best suited to it. Second, English production in stage 1 can be directly assessed against a set of standards and it is easy to ensure that the vision-language model is functioning properly before assessing the translation phase. Third, the modular architecture allows for the upgrading of the translation stage independently, as the translation model for Bangla is improved, without retraining the vision-language core. The method is </w:t>
+      </w:r>
+      <w:proofErr w:type="gramStart"/>
+      <w:r>
+        <w:rPr>
+          <w:b w:val="0"/>
+          <w:bCs w:val="0"/>
+          <w:sz w:val="24"/>
+          <w:szCs w:val="24"/>
+        </w:rPr>
+        <w:t>similar to</w:t>
+      </w:r>
+      <w:proofErr w:type="gramEnd"/>
+      <w:r>
+        <w:rPr>
+          <w:b w:val="0"/>
+          <w:bCs w:val="0"/>
+          <w:sz w:val="24"/>
+          <w:szCs w:val="24"/>
+        </w:rPr>
+        <w:t xml:space="preserve"> the one used by Han et al. (2024) and </w:t>
       </w:r>
       <w:proofErr w:type="spellStart"/>
       <w:r>
@@ -16055,7 +16423,23 @@
           <w:sz w:val="24"/>
           <w:szCs w:val="24"/>
         </w:rPr>
-        <w:t xml:space="preserve">/rad-dino). It takes in 518 × 518 image data and outputs a series of 1370 patch-level feature vectors, each with a size of 768. All the weights of the encoder are fixed during the training and inference process, which means that all the computing resources are allocated to the projector and the language model. The novel cross-attention module is named </w:t>
+        <w:t xml:space="preserve">/rad-dino). It </w:t>
+      </w:r>
+      <w:proofErr w:type="gramStart"/>
+      <w:r>
+        <w:rPr>
+          <w:sz w:val="24"/>
+          <w:szCs w:val="24"/>
+        </w:rPr>
+        <w:t>takes in 518 ×</w:t>
+      </w:r>
+      <w:proofErr w:type="gramEnd"/>
+      <w:r>
+        <w:rPr>
+          <w:sz w:val="24"/>
+          <w:szCs w:val="24"/>
+        </w:rPr>
+        <w:t xml:space="preserve"> 518 image data and outputs a series of 1370 patch-level feature vectors, each with a size of 768. All the weights of the encoder are fixed during the training and inference process, which means that all the computing resources are allocated to the projector and the language model. The novel cross-attention module is named </w:t>
       </w:r>
       <w:proofErr w:type="spellStart"/>
       <w:r>
@@ -16239,7 +16623,23 @@
           <w:sz w:val="24"/>
           <w:szCs w:val="24"/>
         </w:rPr>
-        <w:t xml:space="preserve">, token ID 256026) is specified at inference time to direct the translation. This study does not perform any fine tuning of NLLB-200; it is used as a pretrained model, similar to the baseline use studied in Han et al (2024) and </w:t>
+        <w:t xml:space="preserve">, token ID 256026) is specified at inference time to direct the translation. This study does not perform any fine tuning of NLLB-200; it is used as a pretrained model, </w:t>
+      </w:r>
+      <w:proofErr w:type="gramStart"/>
+      <w:r>
+        <w:rPr>
+          <w:sz w:val="24"/>
+          <w:szCs w:val="24"/>
+        </w:rPr>
+        <w:t>similar to</w:t>
+      </w:r>
+      <w:proofErr w:type="gramEnd"/>
+      <w:r>
+        <w:rPr>
+          <w:sz w:val="24"/>
+          <w:szCs w:val="24"/>
+        </w:rPr>
+        <w:t xml:space="preserve"> the baseline use studied in Han et al (2024) and </w:t>
       </w:r>
       <w:proofErr w:type="spellStart"/>
       <w:r>
@@ -16255,7 +16655,23 @@
           <w:sz w:val="24"/>
           <w:szCs w:val="24"/>
         </w:rPr>
-        <w:t xml:space="preserve"> (2024). The Bangla reference reports for evaluation are generated using the same NLLB-200 model by translating the IU X-ray English reference reports, so that only Stage 2 is evaluated by measuring the similarity of the generated translation to the English reference reports which are generated through the same model, and thus provide a consistent reference for the evaluation.</w:t>
+        <w:t xml:space="preserve"> (2024). The Bangla reference reports for evaluation are generated using the same NLLB-200 model by translating the IU X-ray English reference reports, so that only Stage 2 is evaluated by measuring the similarity of the generated translation to the English reference reports which are generated through the same </w:t>
+      </w:r>
+      <w:proofErr w:type="gramStart"/>
+      <w:r>
+        <w:rPr>
+          <w:sz w:val="24"/>
+          <w:szCs w:val="24"/>
+        </w:rPr>
+        <w:t>model, and</w:t>
+      </w:r>
+      <w:proofErr w:type="gramEnd"/>
+      <w:r>
+        <w:rPr>
+          <w:sz w:val="24"/>
+          <w:szCs w:val="24"/>
+        </w:rPr>
+        <w:t xml:space="preserve"> thus provide a consistent reference for the evaluation.</w:t>
       </w:r>
     </w:p>
     <w:p>
@@ -16343,7 +16759,27 @@
           <w:sz w:val="24"/>
           <w:szCs w:val="24"/>
         </w:rPr>
-        <w:t xml:space="preserve"> et al., 2016) is employed. There are 7,470 images and 3,955 radiology reports in the raw dataset. Following the exclusion of findings and impression fields of missing data, there are 3,826 remaining reports. 3,666 image-report pairs are then obtained after filtering to obtain only image-report pairs of frontal-projections and checking the existence of image files. They are partitioned into a training set (2,566 data points), a validation set (550 data points), and a test set (550 data points) with a random seed of 42 and a 70-15-15 distribution. The images are resized to 518 x 518 pixels, and normalized via the RAD-DINO </w:t>
+        <w:t xml:space="preserve"> et al., 2016) is employed. There are 7,470 images and 3,955 radiology reports in the raw dataset. Following the exclusion of findings and impression fields of missing data, there are 3,826 remaining reports. 3,666 image-report pairs are then obtained after filtering to obtain only image-report pairs of frontal-projections and checking the existence of image files. They are partitioned into a training set (2,566 data points), a validation set (550 data points), and a test set (550 data points) with a random seed of 42 and a 70-15-15 distribution. The images are resized to 518 x 518 </w:t>
+      </w:r>
+      <w:proofErr w:type="gramStart"/>
+      <w:r>
+        <w:rPr>
+          <w:b w:val="0"/>
+          <w:bCs w:val="0"/>
+          <w:sz w:val="24"/>
+          <w:szCs w:val="24"/>
+        </w:rPr>
+        <w:t>pixels, and</w:t>
+      </w:r>
+      <w:proofErr w:type="gramEnd"/>
+      <w:r>
+        <w:rPr>
+          <w:b w:val="0"/>
+          <w:bCs w:val="0"/>
+          <w:sz w:val="24"/>
+          <w:szCs w:val="24"/>
+        </w:rPr>
+        <w:t xml:space="preserve"> normalized via the RAD-DINO </w:t>
       </w:r>
       <w:proofErr w:type="spellStart"/>
       <w:r>
@@ -16445,7 +16881,27 @@
           <w:sz w:val="24"/>
           <w:szCs w:val="24"/>
         </w:rPr>
-        <w:t xml:space="preserve"> layers being 1 × 10⁻⁵, while both groups use weight decay of 0.01. A cosine learning rate schedule with linear warmup over 5% of total steps (320 warmup steps out of 6,415 total) is applied to both groups. The effective batch size is 16 (physical batch size of 2 x 8 gradient accumulations). Gradient norms are clamped at 1.0 to ensure the stability of the training. In order to tackle class imbalance between normal and abnormal cases in IU X-ray, training weight 3.0 is given to the samples whose reports contain abnormal terms, such as consolidation, effusion, pneumothorax, cardiomegaly, atelectasis, and opacity, while its weight is set to 1.0 for the normal ones. This </w:t>
+        <w:t xml:space="preserve"> layers being 1 × 10⁻⁵, while both groups use weight decay of 0.01. A cosine learning rate schedule with linear warmup over 5% of total steps (320 warmup steps out of 6,415 total) is applied to both groups. The effective batch size is 16 (physical batch size of 2 x 8 gradient accumulations). Gradient norms are clamped at 1.0 to ensure the stability of the training. </w:t>
+      </w:r>
+      <w:proofErr w:type="gramStart"/>
+      <w:r>
+        <w:rPr>
+          <w:b w:val="0"/>
+          <w:bCs w:val="0"/>
+          <w:sz w:val="24"/>
+          <w:szCs w:val="24"/>
+        </w:rPr>
+        <w:t>In order to</w:t>
+      </w:r>
+      <w:proofErr w:type="gramEnd"/>
+      <w:r>
+        <w:rPr>
+          <w:b w:val="0"/>
+          <w:bCs w:val="0"/>
+          <w:sz w:val="24"/>
+          <w:szCs w:val="24"/>
+        </w:rPr>
+        <w:t xml:space="preserve"> tackle class imbalance between normal and abnormal cases in IU X-ray, training weight 3.0 is given to the samples whose reports contain abnormal terms, such as consolidation, effusion, pneumothorax, cardiomegaly, atelectasis, and opacity, while its weight is set to 1.0 for the normal ones. This </w:t>
       </w:r>
       <w:proofErr w:type="spellStart"/>
       <w:r>
@@ -16784,7 +17240,23 @@
           <w:sz w:val="24"/>
           <w:szCs w:val="24"/>
         </w:rPr>
-        <w:t xml:space="preserve">All the implementation has been done using open source Python libraries. The deep learning framework and GPU acceleration comes from </w:t>
+        <w:t xml:space="preserve">All the implementation has been done using </w:t>
+      </w:r>
+      <w:proofErr w:type="gramStart"/>
+      <w:r>
+        <w:rPr>
+          <w:sz w:val="24"/>
+          <w:szCs w:val="24"/>
+        </w:rPr>
+        <w:t>open source</w:t>
+      </w:r>
+      <w:proofErr w:type="gramEnd"/>
+      <w:r>
+        <w:rPr>
+          <w:sz w:val="24"/>
+          <w:szCs w:val="24"/>
+        </w:rPr>
+        <w:t xml:space="preserve"> Python libraries. The deep learning framework and GPU acceleration comes from </w:t>
       </w:r>
       <w:proofErr w:type="spellStart"/>
       <w:r>
@@ -16904,7 +17376,23 @@
           <w:sz w:val="24"/>
           <w:szCs w:val="24"/>
         </w:rPr>
-        <w:t xml:space="preserve">++ for evaluation. Pandas and NumPy process the data, and Matplotlib create training curves and performance visualizations. The entire pipeline is implemented in three Jupyter notebooks: bangla_cxr_local_stage_1.ipynb for the novel </w:t>
+        <w:t>++ for evaluation. Pandas and NumPy process the data, and Matplotlib create training curves and performance visualizations. The entire pipeline is implemented in three Jupyter notebooks: bangla_cxr_local_stage_</w:t>
+      </w:r>
+      <w:proofErr w:type="gramStart"/>
+      <w:r>
+        <w:rPr>
+          <w:sz w:val="24"/>
+          <w:szCs w:val="24"/>
+        </w:rPr>
+        <w:t>1.ipynb</w:t>
+      </w:r>
+      <w:proofErr w:type="gramEnd"/>
+      <w:r>
+        <w:rPr>
+          <w:sz w:val="24"/>
+          <w:szCs w:val="24"/>
+        </w:rPr>
+        <w:t xml:space="preserve"> for the novel </w:t>
       </w:r>
       <w:proofErr w:type="spellStart"/>
       <w:r>
@@ -16920,7 +17408,23 @@
           <w:sz w:val="24"/>
           <w:szCs w:val="24"/>
         </w:rPr>
-        <w:t xml:space="preserve"> model, bangla_cxr_local_stage_1_baseline.ipynb for the </w:t>
+        <w:t xml:space="preserve"> model, bangla_cxr_local_stage_1_</w:t>
+      </w:r>
+      <w:proofErr w:type="gramStart"/>
+      <w:r>
+        <w:rPr>
+          <w:sz w:val="24"/>
+          <w:szCs w:val="24"/>
+        </w:rPr>
+        <w:t>baseline.ipynb</w:t>
+      </w:r>
+      <w:proofErr w:type="gramEnd"/>
+      <w:r>
+        <w:rPr>
+          <w:sz w:val="24"/>
+          <w:szCs w:val="24"/>
+        </w:rPr>
+        <w:t xml:space="preserve"> for the </w:t>
       </w:r>
       <w:proofErr w:type="spellStart"/>
       <w:r>
@@ -16936,7 +17440,23 @@
           <w:sz w:val="24"/>
           <w:szCs w:val="24"/>
         </w:rPr>
-        <w:t xml:space="preserve"> ablation and bangla_cxr_local_stage_2.ipynb for the Bangla translation stage. The training is conducted locally with an NVIDIA GeForce RTX 5050 Laptop GPU, using Python 3.10.20 (Anaconda distribution) and Windows 1</w:t>
+        <w:t xml:space="preserve"> ablation and bangla_cxr_local_stage_</w:t>
+      </w:r>
+      <w:proofErr w:type="gramStart"/>
+      <w:r>
+        <w:rPr>
+          <w:sz w:val="24"/>
+          <w:szCs w:val="24"/>
+        </w:rPr>
+        <w:t>2.ipynb</w:t>
+      </w:r>
+      <w:proofErr w:type="gramEnd"/>
+      <w:r>
+        <w:rPr>
+          <w:sz w:val="24"/>
+          <w:szCs w:val="24"/>
+        </w:rPr>
+        <w:t xml:space="preserve"> for the Bangla translation stage. The training is conducted locally with an NVIDIA GeForce RTX 5050 Laptop GPU, using Python 3.10.20 (Anaconda distribution) and Windows 1</w:t>
       </w:r>
       <w:r>
         <w:rPr>
@@ -17019,7 +17539,21 @@
         <w:rPr>
           <w:szCs w:val="22"/>
         </w:rPr>
-        <w:t xml:space="preserve"> and its integration with the English Report Generation model (RAD-DINO and Phi-3.5 Mini), and complete implementation of the proposed approach including the dataset preparation, training configuration, inference procedure, and evaluation framework. The proposed system meets the specified compute requirements, is based on a set of well-established design choices from the literature with proven performance, and clearly contributes to the system architecture, with the cross-attention projector tested for necessity in the ablation study. The experimental results of the novel model and the </w:t>
+        <w:t xml:space="preserve"> and its integration with the English Report Generation model (RAD-DINO and Phi-3.5 Mini), and complete implementation of the proposed approach including the dataset preparation, training configuration, inference procedure, and evaluation framework. The proposed system meets the specified compute requirements, is based on a set of well-established design choices from </w:t>
+      </w:r>
+      <w:proofErr w:type="gramStart"/>
+      <w:r>
+        <w:rPr>
+          <w:szCs w:val="22"/>
+        </w:rPr>
+        <w:t>the literature</w:t>
+      </w:r>
+      <w:proofErr w:type="gramEnd"/>
+      <w:r>
+        <w:rPr>
+          <w:szCs w:val="22"/>
+        </w:rPr>
+        <w:t xml:space="preserve"> with proven performance, and clearly contributes to the system architecture, with the cross-attention projector tested for necessity in the ablation study. The experimental results of the novel model and the </w:t>
       </w:r>
       <w:proofErr w:type="spellStart"/>
       <w:r>
@@ -17331,7 +17865,27 @@
           <w:sz w:val="24"/>
           <w:szCs w:val="24"/>
         </w:rPr>
-        <w:t xml:space="preserve"> system in both the stages of pipeline will be presented. It builds upon the architecture and methodology described in Chapter 3 and details the hardware and software environment in which it was developed and implemented, the step-by-step implementation of the Stage 1 English report generation model and the Stage 2 Bangla translation pipeline, the evaluation framework adopted for both stages, and a detailed discussion of the results including the ablation study comparing the proposed </w:t>
+        <w:t xml:space="preserve"> system in both the </w:t>
+      </w:r>
+      <w:proofErr w:type="gramStart"/>
+      <w:r>
+        <w:rPr>
+          <w:b w:val="0"/>
+          <w:bCs w:val="0"/>
+          <w:sz w:val="24"/>
+          <w:szCs w:val="24"/>
+        </w:rPr>
+        <w:t>stages of pipeline</w:t>
+      </w:r>
+      <w:proofErr w:type="gramEnd"/>
+      <w:r>
+        <w:rPr>
+          <w:b w:val="0"/>
+          <w:bCs w:val="0"/>
+          <w:sz w:val="24"/>
+          <w:szCs w:val="24"/>
+        </w:rPr>
+        <w:t xml:space="preserve"> will be presented. It builds upon the architecture and methodology described in Chapter 3 and details the hardware and software environment in which it was developed and implemented, the step-by-step implementation of the Stage 1 English report generation model and the Stage 2 Bangla translation pipeline, the evaluation framework adopted for both stages, and a detailed discussion of the results including the ablation study comparing the proposed </w:t>
       </w:r>
       <w:proofErr w:type="spellStart"/>
       <w:r>
@@ -17371,7 +17925,47 @@
           <w:sz w:val="24"/>
           <w:szCs w:val="24"/>
         </w:rPr>
-        <w:t xml:space="preserve"> baseline architecture. The chapter ends with situating the findings in the context of the research purposes as well as in the context of the existing literature.</w:t>
+        <w:t xml:space="preserve"> baseline architecture. The chapter ends with situating the findings in the context of </w:t>
+      </w:r>
+      <w:proofErr w:type="gramStart"/>
+      <w:r>
+        <w:rPr>
+          <w:b w:val="0"/>
+          <w:bCs w:val="0"/>
+          <w:sz w:val="24"/>
+          <w:szCs w:val="24"/>
+        </w:rPr>
+        <w:t>the research</w:t>
+      </w:r>
+      <w:proofErr w:type="gramEnd"/>
+      <w:r>
+        <w:rPr>
+          <w:b w:val="0"/>
+          <w:bCs w:val="0"/>
+          <w:sz w:val="24"/>
+          <w:szCs w:val="24"/>
+        </w:rPr>
+        <w:t xml:space="preserve"> purposes as well as in the context of </w:t>
+      </w:r>
+      <w:proofErr w:type="gramStart"/>
+      <w:r>
+        <w:rPr>
+          <w:b w:val="0"/>
+          <w:bCs w:val="0"/>
+          <w:sz w:val="24"/>
+          <w:szCs w:val="24"/>
+        </w:rPr>
+        <w:t>the existing</w:t>
+      </w:r>
+      <w:proofErr w:type="gramEnd"/>
+      <w:r>
+        <w:rPr>
+          <w:b w:val="0"/>
+          <w:bCs w:val="0"/>
+          <w:sz w:val="24"/>
+          <w:szCs w:val="24"/>
+        </w:rPr>
+        <w:t xml:space="preserve"> literature.</w:t>
       </w:r>
       <w:bookmarkEnd w:id="76"/>
       <w:bookmarkEnd w:id="77"/>
@@ -17441,6 +18035,7 @@
         <w:t xml:space="preserve">An overview of the system setup and </w:t>
       </w:r>
       <w:proofErr w:type="spellStart"/>
+      <w:proofErr w:type="gramStart"/>
       <w:r>
         <w:rPr>
           <w:b w:val="0"/>
@@ -17451,6 +18046,7 @@
         <w:t>environment.System</w:t>
       </w:r>
       <w:proofErr w:type="spellEnd"/>
+      <w:proofErr w:type="gramEnd"/>
       <w:r>
         <w:rPr>
           <w:b w:val="0"/>
@@ -17581,6 +18177,7 @@
         <w:t xml:space="preserve">++ </w:t>
       </w:r>
       <w:proofErr w:type="spellStart"/>
+      <w:proofErr w:type="gramStart"/>
       <w:r>
         <w:rPr>
           <w:b w:val="0"/>
@@ -17591,6 +18188,7 @@
         <w:t>respectively.BLEU</w:t>
       </w:r>
       <w:proofErr w:type="spellEnd"/>
+      <w:proofErr w:type="gramEnd"/>
       <w:r>
         <w:rPr>
           <w:b w:val="0"/>
@@ -17658,7 +18256,67 @@
           <w:sz w:val="24"/>
           <w:szCs w:val="24"/>
         </w:rPr>
-        <w:t xml:space="preserve"> notebooks, namely the bangla_cxr_local_stage_1.ipynb, bangla_cxr_local_stage_1_baseline.ipynb and bangla_cxr_local_stage_2.ipynb.</w:t>
+        <w:t xml:space="preserve"> notebooks, namely the bangla_cxr_local_stage_</w:t>
+      </w:r>
+      <w:proofErr w:type="gramStart"/>
+      <w:r>
+        <w:rPr>
+          <w:b w:val="0"/>
+          <w:bCs w:val="0"/>
+          <w:sz w:val="24"/>
+          <w:szCs w:val="24"/>
+        </w:rPr>
+        <w:t>1.ipynb</w:t>
+      </w:r>
+      <w:proofErr w:type="gramEnd"/>
+      <w:r>
+        <w:rPr>
+          <w:b w:val="0"/>
+          <w:bCs w:val="0"/>
+          <w:sz w:val="24"/>
+          <w:szCs w:val="24"/>
+        </w:rPr>
+        <w:t>, bangla_cxr_local_stage_1_</w:t>
+      </w:r>
+      <w:proofErr w:type="gramStart"/>
+      <w:r>
+        <w:rPr>
+          <w:b w:val="0"/>
+          <w:bCs w:val="0"/>
+          <w:sz w:val="24"/>
+          <w:szCs w:val="24"/>
+        </w:rPr>
+        <w:t>baseline.ipynb</w:t>
+      </w:r>
+      <w:proofErr w:type="gramEnd"/>
+      <w:r>
+        <w:rPr>
+          <w:b w:val="0"/>
+          <w:bCs w:val="0"/>
+          <w:sz w:val="24"/>
+          <w:szCs w:val="24"/>
+        </w:rPr>
+        <w:t xml:space="preserve"> and bangla_cxr_local_stage_</w:t>
+      </w:r>
+      <w:proofErr w:type="gramStart"/>
+      <w:r>
+        <w:rPr>
+          <w:b w:val="0"/>
+          <w:bCs w:val="0"/>
+          <w:sz w:val="24"/>
+          <w:szCs w:val="24"/>
+        </w:rPr>
+        <w:t>2.ipynb</w:t>
+      </w:r>
+      <w:proofErr w:type="gramEnd"/>
+      <w:r>
+        <w:rPr>
+          <w:b w:val="0"/>
+          <w:bCs w:val="0"/>
+          <w:sz w:val="24"/>
+          <w:szCs w:val="24"/>
+        </w:rPr>
+        <w:t>.</w:t>
       </w:r>
       <w:bookmarkEnd w:id="79"/>
       <w:bookmarkEnd w:id="80"/>
@@ -17748,6 +18406,7 @@
         <w:t xml:space="preserve">The Stage 1 implementation starts with the preprocessing of data sets. The raw IU X-ray dataset was loaded from the CSV reports and projections file and only those images that had a </w:t>
       </w:r>
       <w:proofErr w:type="spellStart"/>
+      <w:proofErr w:type="gramStart"/>
       <w:r>
         <w:rPr>
           <w:b w:val="0"/>
@@ -17758,6 +18417,7 @@
         <w:t>non empty</w:t>
       </w:r>
       <w:proofErr w:type="spellEnd"/>
+      <w:proofErr w:type="gramEnd"/>
       <w:r>
         <w:rPr>
           <w:b w:val="0"/>
@@ -17965,7 +18625,27 @@
           <w:sz w:val="24"/>
           <w:szCs w:val="24"/>
         </w:rPr>
-        <w:t xml:space="preserve"> layers with a learning rate of 1 × 10⁻⁵, and both groups had weight decay of 0.01. The optimum batch size was 16, obtained by using a physical batch size of 2, and 8 gradient accumulation steps, with gradient norms clipped at 1.0 per step. Both sets of parameters were subjected to a cosine schedule, with 5% warm up (320 warm up steps out of 6,415 total). The training was conducted for up to 40 epochs, with an early stopping patience of 8. Model checkpoint was saved if there was a decrease in validation loss. During inference, the pipeline will load the saved checkpoint and re-initialize the model using frozen RAD-DINO weights and the trained projector and </w:t>
+        <w:t xml:space="preserve"> layers with a learning rate of 1 × 10⁻⁵, and both groups had weight decay of 0.01. The optimum batch size was 16, obtained by using a physical batch size of 2, and 8 gradient accumulation steps, with gradient norms clipped at 1.0 per step. Both sets of parameters were subjected to a cosine schedule, with 5% warm up (320 warm up steps out of 6,415 total). The training was conducted for up to 40 epochs, with an early stopping patience of 8. Model </w:t>
+      </w:r>
+      <w:proofErr w:type="gramStart"/>
+      <w:r>
+        <w:rPr>
+          <w:b w:val="0"/>
+          <w:bCs w:val="0"/>
+          <w:sz w:val="24"/>
+          <w:szCs w:val="24"/>
+        </w:rPr>
+        <w:t>checkpoint was</w:t>
+      </w:r>
+      <w:proofErr w:type="gramEnd"/>
+      <w:r>
+        <w:rPr>
+          <w:b w:val="0"/>
+          <w:bCs w:val="0"/>
+          <w:sz w:val="24"/>
+          <w:szCs w:val="24"/>
+        </w:rPr>
+        <w:t xml:space="preserve"> saved if there was a decrease in validation loss. During inference, the pipeline will load the saved checkpoint and re-initialize the model using frozen RAD-DINO weights and the trained projector and </w:t>
       </w:r>
       <w:proofErr w:type="spellStart"/>
       <w:r>
@@ -18119,7 +18799,27 @@
           <w:sz w:val="24"/>
           <w:szCs w:val="24"/>
         </w:rPr>
-        <w:t xml:space="preserve"> baseline simply applies a mean-pooling operation over all 1,370 RAD-DINO patch tokens followed by a two-layer MLP that generates a single 3,072-dimensional embedding. This reduces the whole visual context into a single query per token, and directly compares to the mean-pooling projectors of systems like </w:t>
+        <w:t xml:space="preserve"> baseline simply applies a mean-pooling operation over all 1,370 RAD-DINO patch tokens followed by a two-layer MLP that generates a single 3,072-dimensional embedding. This reduces the whole visual context into a single query per </w:t>
+      </w:r>
+      <w:proofErr w:type="gramStart"/>
+      <w:r>
+        <w:rPr>
+          <w:b w:val="0"/>
+          <w:bCs w:val="0"/>
+          <w:sz w:val="24"/>
+          <w:szCs w:val="24"/>
+        </w:rPr>
+        <w:t>token, and</w:t>
+      </w:r>
+      <w:proofErr w:type="gramEnd"/>
+      <w:r>
+        <w:rPr>
+          <w:b w:val="0"/>
+          <w:bCs w:val="0"/>
+          <w:sz w:val="24"/>
+          <w:szCs w:val="24"/>
+        </w:rPr>
+        <w:t xml:space="preserve"> directly compares to the mean-pooling projectors of systems like </w:t>
       </w:r>
       <w:proofErr w:type="spellStart"/>
       <w:r>
@@ -18142,6 +18842,7 @@
         <w:t xml:space="preserve">, which applied different projectors to each of 32 region-based </w:t>
       </w:r>
       <w:proofErr w:type="spellStart"/>
+      <w:proofErr w:type="gramStart"/>
       <w:r>
         <w:rPr>
           <w:b w:val="0"/>
@@ -18152,6 +18853,7 @@
         <w:t>queries.This</w:t>
       </w:r>
       <w:proofErr w:type="spellEnd"/>
+      <w:proofErr w:type="gramEnd"/>
       <w:r>
         <w:rPr>
           <w:b w:val="0"/>
@@ -18199,7 +18901,27 @@
           <w:sz w:val="24"/>
           <w:szCs w:val="24"/>
         </w:rPr>
-        <w:t xml:space="preserve"> configuration, the same training loop, the same split of the dataset, and the same hyperparameters and early stopping criterion.</w:t>
+        <w:t xml:space="preserve"> configuration, the same training loop, the same split of the dataset, and the same hyperparameters and early stopping </w:t>
+      </w:r>
+      <w:proofErr w:type="gramStart"/>
+      <w:r>
+        <w:rPr>
+          <w:b w:val="0"/>
+          <w:bCs w:val="0"/>
+          <w:sz w:val="24"/>
+          <w:szCs w:val="24"/>
+        </w:rPr>
+        <w:t>criterion</w:t>
+      </w:r>
+      <w:proofErr w:type="gramEnd"/>
+      <w:r>
+        <w:rPr>
+          <w:b w:val="0"/>
+          <w:bCs w:val="0"/>
+          <w:sz w:val="24"/>
+          <w:szCs w:val="24"/>
+        </w:rPr>
+        <w:t>.</w:t>
       </w:r>
       <w:bookmarkEnd w:id="82"/>
       <w:bookmarkEnd w:id="83"/>
@@ -18569,7 +19291,47 @@
           <w:sz w:val="24"/>
           <w:szCs w:val="24"/>
         </w:rPr>
-        <w:t xml:space="preserve"> model was steady over 25 epochs until it reached the point of early stopping. The validation loss had a dramatic drop between epochs 1 and 2, from 2.6083 to 1.6051, and continued to improve until epoch 18 with a best value of 0.5516, but eventually stagnated and then began to increase at epoch 25, with a validation loss of 0.5516, without further improvement over the last 8 epochs, prompting early stopping at epoch 25. Throughout the training loss continued to decline, and at epoch 25, it was at 0.2444, suggesting that the model did not overfit much before early stopping kicked in. The last saved checkpoint is at epoch 18 with validation loss 0.5516. The baseline was also terminated early for the </w:t>
+        <w:t xml:space="preserve"> model was steady over 25 epochs until it reached the point of early stopping. The validation loss had a dramatic drop between epochs 1 and 2, from 2.6083 to 1.6051, and continued to improve until epoch 18 with a best value of </w:t>
+      </w:r>
+      <w:proofErr w:type="gramStart"/>
+      <w:r>
+        <w:rPr>
+          <w:b w:val="0"/>
+          <w:bCs w:val="0"/>
+          <w:sz w:val="24"/>
+          <w:szCs w:val="24"/>
+        </w:rPr>
+        <w:t>0.5516, but</w:t>
+      </w:r>
+      <w:proofErr w:type="gramEnd"/>
+      <w:r>
+        <w:rPr>
+          <w:b w:val="0"/>
+          <w:bCs w:val="0"/>
+          <w:sz w:val="24"/>
+          <w:szCs w:val="24"/>
+        </w:rPr>
+        <w:t xml:space="preserve"> eventually stagnated and then began to increase at epoch 25, with a validation loss of 0.5516, without further improvement over the last 8 epochs, prompting early stopping at epoch 25. Throughout the training loss continued to decline, and at epoch 25, it was at 0.2444, suggesting that the model did not overfit much before early stopping kicked in. The last </w:t>
+      </w:r>
+      <w:proofErr w:type="gramStart"/>
+      <w:r>
+        <w:rPr>
+          <w:b w:val="0"/>
+          <w:bCs w:val="0"/>
+          <w:sz w:val="24"/>
+          <w:szCs w:val="24"/>
+        </w:rPr>
+        <w:t>saved checkpoint</w:t>
+      </w:r>
+      <w:proofErr w:type="gramEnd"/>
+      <w:r>
+        <w:rPr>
+          <w:b w:val="0"/>
+          <w:bCs w:val="0"/>
+          <w:sz w:val="24"/>
+          <w:szCs w:val="24"/>
+        </w:rPr>
+        <w:t xml:space="preserve"> is at epoch 18 with validation loss 0.5516. The baseline was also terminated early for the </w:t>
       </w:r>
       <w:proofErr w:type="spellStart"/>
       <w:r>
@@ -18589,7 +19351,47 @@
           <w:sz w:val="24"/>
           <w:szCs w:val="24"/>
         </w:rPr>
-        <w:t xml:space="preserve">, but in a different way. The lowest validation loss achieved was 1.5710 at epoch 3, but then the model did not improve further and plateaued at epoch 10. The validation loss for the baseline was consistently &gt;1.57 while for the </w:t>
+        <w:t xml:space="preserve">, but in a different way. The lowest validation loss achieved was 1.5710 at </w:t>
+      </w:r>
+      <w:proofErr w:type="gramStart"/>
+      <w:r>
+        <w:rPr>
+          <w:b w:val="0"/>
+          <w:bCs w:val="0"/>
+          <w:sz w:val="24"/>
+          <w:szCs w:val="24"/>
+        </w:rPr>
+        <w:t>epoch</w:t>
+      </w:r>
+      <w:proofErr w:type="gramEnd"/>
+      <w:r>
+        <w:rPr>
+          <w:b w:val="0"/>
+          <w:bCs w:val="0"/>
+          <w:sz w:val="24"/>
+          <w:szCs w:val="24"/>
+        </w:rPr>
+        <w:t xml:space="preserve"> 3, but then the model did not improve further and plateaued at </w:t>
+      </w:r>
+      <w:proofErr w:type="gramStart"/>
+      <w:r>
+        <w:rPr>
+          <w:b w:val="0"/>
+          <w:bCs w:val="0"/>
+          <w:sz w:val="24"/>
+          <w:szCs w:val="24"/>
+        </w:rPr>
+        <w:t>epoch</w:t>
+      </w:r>
+      <w:proofErr w:type="gramEnd"/>
+      <w:r>
+        <w:rPr>
+          <w:b w:val="0"/>
+          <w:bCs w:val="0"/>
+          <w:sz w:val="24"/>
+          <w:szCs w:val="24"/>
+        </w:rPr>
+        <w:t xml:space="preserve"> 10. The validation loss for the baseline was consistently &gt;1.57 while for the </w:t>
       </w:r>
       <w:proofErr w:type="spellStart"/>
       <w:r>
@@ -18741,7 +19543,47 @@
           <w:sz w:val="24"/>
           <w:szCs w:val="24"/>
         </w:rPr>
-        <w:t xml:space="preserve"> a necessary architectural feature and not merely a better option. The achieved score of 0.4352 in ROUGE-1 is significantly comparable with the 0.3213 score obtained by </w:t>
+        <w:t xml:space="preserve"> a necessary architectural feature and not merely a better option. The </w:t>
+      </w:r>
+      <w:proofErr w:type="gramStart"/>
+      <w:r>
+        <w:rPr>
+          <w:b w:val="0"/>
+          <w:bCs w:val="0"/>
+          <w:sz w:val="24"/>
+          <w:szCs w:val="24"/>
+        </w:rPr>
+        <w:t>achieved score</w:t>
+      </w:r>
+      <w:proofErr w:type="gramEnd"/>
+      <w:r>
+        <w:rPr>
+          <w:b w:val="0"/>
+          <w:bCs w:val="0"/>
+          <w:sz w:val="24"/>
+          <w:szCs w:val="24"/>
+        </w:rPr>
+        <w:t xml:space="preserve"> of 0.4352 in ROUGE-1 is significantly comparable with the </w:t>
+      </w:r>
+      <w:proofErr w:type="gramStart"/>
+      <w:r>
+        <w:rPr>
+          <w:b w:val="0"/>
+          <w:bCs w:val="0"/>
+          <w:sz w:val="24"/>
+          <w:szCs w:val="24"/>
+        </w:rPr>
+        <w:t>0.3213 score</w:t>
+      </w:r>
+      <w:proofErr w:type="gramEnd"/>
+      <w:r>
+        <w:rPr>
+          <w:b w:val="0"/>
+          <w:bCs w:val="0"/>
+          <w:sz w:val="24"/>
+          <w:szCs w:val="24"/>
+        </w:rPr>
+        <w:t xml:space="preserve"> obtained by </w:t>
       </w:r>
       <w:proofErr w:type="spellStart"/>
       <w:r>
@@ -18923,7 +19765,107 @@
           <w:sz w:val="24"/>
           <w:szCs w:val="24"/>
         </w:rPr>
-        <w:t xml:space="preserve">There is marked variation in performance between pathological categories in the clinical entity evaluation. The model's performance is best on common, visually distinct findings: Pleural Effusion has an F1 score of 0.7164 and a recall score of 0.867, Pneumothorax has an F1 score of 0.7532 with a recall score of 0.904, and No Finding (normal chest) has an F1 score of 0.7962 with a recall score of 0.830. These are the categories that are most commonly found in the IU X-ray training set and the ones that are most likely to have a clear and unambiguous visual pattern in chest X-ray images. The model has a significant difficulty with less common or less obvious findings: Fracture gets an F1 of 0.0000, Nodule/Mass gets an F1 of 0.0909, and Edema gets an F1 of 0.1263. Atelectasis (F1 = 0.2500) and Consolidation (F1 = 0.2895) are also low, but do seem to be present in the training set despite the weighted sampler, and they are also quite subtle from a visual standpoint. The overall binary abnormality detection results are more promising: the model correctly identified 430 of the 439 truly abnormal cases in the test set, missed 9 (false negative), and created 108 false alarms (false positive) from the 111 normal cases. This yields a recall of 0.9795 and precision of 0.7993, with an F1 of 0.8802. In the clinical </w:t>
+        <w:t xml:space="preserve">There is marked variation in performance between pathological categories in the clinical entity evaluation. The model's performance is best on common, visually distinct findings: Pleural Effusion has an F1 score of 0.7164 and a recall score of 0.867, Pneumothorax has an F1 score of 0.7532 with a recall score of 0.904, and No Finding (normal chest) has an F1 score of 0.7962 with a recall score of 0.830. These are the categories that are </w:t>
+      </w:r>
+      <w:proofErr w:type="gramStart"/>
+      <w:r>
+        <w:rPr>
+          <w:b w:val="0"/>
+          <w:bCs w:val="0"/>
+          <w:sz w:val="24"/>
+          <w:szCs w:val="24"/>
+        </w:rPr>
+        <w:t>most commonly found</w:t>
+      </w:r>
+      <w:proofErr w:type="gramEnd"/>
+      <w:r>
+        <w:rPr>
+          <w:b w:val="0"/>
+          <w:bCs w:val="0"/>
+          <w:sz w:val="24"/>
+          <w:szCs w:val="24"/>
+        </w:rPr>
+        <w:t xml:space="preserve"> in the IU X-ray training set and the ones that are most likely to have a clear and unambiguous visual pattern in chest X-ray images. The model has </w:t>
+      </w:r>
+      <w:proofErr w:type="gramStart"/>
+      <w:r>
+        <w:rPr>
+          <w:b w:val="0"/>
+          <w:bCs w:val="0"/>
+          <w:sz w:val="24"/>
+          <w:szCs w:val="24"/>
+        </w:rPr>
+        <w:t>a significant</w:t>
+      </w:r>
+      <w:proofErr w:type="gramEnd"/>
+      <w:r>
+        <w:rPr>
+          <w:b w:val="0"/>
+          <w:bCs w:val="0"/>
+          <w:sz w:val="24"/>
+          <w:szCs w:val="24"/>
+        </w:rPr>
+        <w:t xml:space="preserve"> difficulty with less common or less obvious findings: Fracture gets an F1 of 0.0000, Nodule/Mass gets an F1 of 0.0909, and Edema gets an F1 of 0.1263. Atelectasis (F1 = 0.2500) and Consolidation (F1 = 0.2895) are also </w:t>
+      </w:r>
+      <w:proofErr w:type="gramStart"/>
+      <w:r>
+        <w:rPr>
+          <w:b w:val="0"/>
+          <w:bCs w:val="0"/>
+          <w:sz w:val="24"/>
+          <w:szCs w:val="24"/>
+        </w:rPr>
+        <w:t>low, but</w:t>
+      </w:r>
+      <w:proofErr w:type="gramEnd"/>
+      <w:r>
+        <w:rPr>
+          <w:b w:val="0"/>
+          <w:bCs w:val="0"/>
+          <w:sz w:val="24"/>
+          <w:szCs w:val="24"/>
+        </w:rPr>
+        <w:t xml:space="preserve"> do seem to be present in the training set despite the weighted sampler, and they are also quite subtle from a visual standpoint. The overall binary abnormality detection results are more promising: the model correctly identified 430 of the 439 truly abnormal cases in the test set, missed 9 (false negative), and created </w:t>
+      </w:r>
+      <w:proofErr w:type="gramStart"/>
+      <w:r>
+        <w:rPr>
+          <w:b w:val="0"/>
+          <w:bCs w:val="0"/>
+          <w:sz w:val="24"/>
+          <w:szCs w:val="24"/>
+        </w:rPr>
+        <w:t>108 false alarms (</w:t>
+      </w:r>
+      <w:proofErr w:type="gramEnd"/>
+      <w:r>
+        <w:rPr>
+          <w:b w:val="0"/>
+          <w:bCs w:val="0"/>
+          <w:sz w:val="24"/>
+          <w:szCs w:val="24"/>
+        </w:rPr>
+        <w:t xml:space="preserve">false positive) from </w:t>
+      </w:r>
+      <w:proofErr w:type="gramStart"/>
+      <w:r>
+        <w:rPr>
+          <w:b w:val="0"/>
+          <w:bCs w:val="0"/>
+          <w:sz w:val="24"/>
+          <w:szCs w:val="24"/>
+        </w:rPr>
+        <w:t>the 111</w:t>
+      </w:r>
+      <w:proofErr w:type="gramEnd"/>
+      <w:r>
+        <w:rPr>
+          <w:b w:val="0"/>
+          <w:bCs w:val="0"/>
+          <w:sz w:val="24"/>
+          <w:szCs w:val="24"/>
+        </w:rPr>
+        <w:t xml:space="preserve"> normal cases. This yields a recall of 0.9795 and precision of 0.7993, with an F1 of 0.8802. In the clinical </w:t>
       </w:r>
       <w:r>
         <w:rPr>
@@ -19015,7 +19957,27 @@
           <w:sz w:val="24"/>
           <w:szCs w:val="24"/>
         </w:rPr>
-        <w:t xml:space="preserve">++ value for Stage 1 English to 41.32 and Stage 2 Bangla to 35.18 is the cumulative impact of two steps that are imperfect: Step 1 is to generate the English text that diverges from the reference, and Step 2 is to translate the generated text to Bangla and the reference to Bangla, which may introduce further level of character level differences. Sample Bangla outputs from the qualitative inspection reveals that generated reports are grammatically correct Bangla which preserves the clinical structure of the English input including Findings/Impression, and correctly renders key pathological terms such as </w:t>
+        <w:t>++ value for Stage 1 English to 41.32 and Stage 2 Bangla to 35.18 is the cumulative impact of two steps that are imperfect: Step 1 is to generate the English text that diverges from the reference, and Step 2 is to translate the generated text to Bangla and the reference to Bangla, which may introduce further level of character level differences. Sample Bangla outputs from the qualitative inspection reveals that generated reports are grammatically correct Bangla which preserves the clinical structure of the English input including Findings/</w:t>
+      </w:r>
+      <w:proofErr w:type="gramStart"/>
+      <w:r>
+        <w:rPr>
+          <w:b w:val="0"/>
+          <w:bCs w:val="0"/>
+          <w:sz w:val="24"/>
+          <w:szCs w:val="24"/>
+        </w:rPr>
+        <w:t>Impression, and</w:t>
+      </w:r>
+      <w:proofErr w:type="gramEnd"/>
+      <w:r>
+        <w:rPr>
+          <w:b w:val="0"/>
+          <w:bCs w:val="0"/>
+          <w:sz w:val="24"/>
+          <w:szCs w:val="24"/>
+        </w:rPr>
+        <w:t xml:space="preserve"> correctly renders key pathological terms such as </w:t>
       </w:r>
       <w:proofErr w:type="spellStart"/>
       <w:r>
@@ -19239,7 +20201,27 @@
           <w:sz w:val="24"/>
           <w:szCs w:val="24"/>
         </w:rPr>
-        <w:t xml:space="preserve">This chapter has showed the complete implementation and evaluation of </w:t>
+        <w:t xml:space="preserve">This chapter </w:t>
+      </w:r>
+      <w:proofErr w:type="gramStart"/>
+      <w:r>
+        <w:rPr>
+          <w:b w:val="0"/>
+          <w:bCs w:val="0"/>
+          <w:sz w:val="24"/>
+          <w:szCs w:val="24"/>
+        </w:rPr>
+        <w:t>has showed</w:t>
+      </w:r>
+      <w:proofErr w:type="gramEnd"/>
+      <w:r>
+        <w:rPr>
+          <w:b w:val="0"/>
+          <w:bCs w:val="0"/>
+          <w:sz w:val="24"/>
+          <w:szCs w:val="24"/>
+        </w:rPr>
+        <w:t xml:space="preserve"> the complete implementation and evaluation of </w:t>
       </w:r>
       <w:proofErr w:type="spellStart"/>
       <w:r>
@@ -19820,7 +20802,27 @@
           <w:sz w:val="24"/>
           <w:szCs w:val="24"/>
         </w:rPr>
-        <w:t xml:space="preserve"> followed the following known principles from the relevant standards bodies and AI ethics frameworks that are applicable to AI medical systems. A software engineering point of view, the implementation is designed and reproducible according to the IEEE guidelines for scientific software, that is, fixed random seeds (all dataset splits used with seed 42), version pinned library dependencies, notebook structure (allows the full evaluation to be independently reproduced by others) and saved model checkpoints. AI and machine learning side, the system's design follows the principles of the recent NIST AI RMF (Risk Management Framework) for trustworthy AI, such as transparency of AI system architecture and training process, measurable performance against a range of evaluation metrics, and documented failures. The training and evaluation is based on an existing public benchmark dataset (IU X-ray) instead of private clinical data, which is in line with open science practices and external validation. Meta's NLLB-200, a model designed specifically for low-resource languages, is based on the principles of responsible AI, is translated with this pipeline, and is developed by Meta AI Research. The system is not yet compliant with clinical device regulations like the FDA's Medical Device Software (SaMD) guidelines, or the EU Medical Device Regulation (MDR); it has not been clinically validated in a health care environment; not been prospectively evaluated by patients' outcomes; and has not included the clinical deployment audit trail mechanisms that are required. Any attempt to bring this to actual clinical practice would require compliance with these regulations.</w:t>
+        <w:t xml:space="preserve"> followed the following known principles from the relevant standards bodies and AI ethics frameworks that are applicable to AI medical systems. A software engineering point of view, the implementation is designed and reproducible according to the IEEE guidelines for scientific software, that is, fixed random seeds (all dataset splits used with seed 42), version pinned library dependencies, notebook structure (allows the full evaluation to be independently reproduced by others) and saved model checkpoints. AI and machine learning side, the system's design follows the principles of the recent NIST AI RMF (Risk Management Framework) for trustworthy AI, such as transparency of AI system architecture and training process, measurable performance against a range of evaluation metrics, and documented failures. The training and evaluation </w:t>
+      </w:r>
+      <w:proofErr w:type="gramStart"/>
+      <w:r>
+        <w:rPr>
+          <w:b w:val="0"/>
+          <w:bCs w:val="0"/>
+          <w:sz w:val="24"/>
+          <w:szCs w:val="24"/>
+        </w:rPr>
+        <w:t>is</w:t>
+      </w:r>
+      <w:proofErr w:type="gramEnd"/>
+      <w:r>
+        <w:rPr>
+          <w:b w:val="0"/>
+          <w:bCs w:val="0"/>
+          <w:sz w:val="24"/>
+          <w:szCs w:val="24"/>
+        </w:rPr>
+        <w:t xml:space="preserve"> based on an existing public benchmark dataset (IU X-ray) instead of private clinical data, which is in line with open science practices and external validation. Meta's NLLB-200, a model designed specifically for low-resource languages, is based on the principles of responsible AI, is translated with this pipeline, and is developed by Meta AI Research. The system is not yet compliant with clinical device regulations like the FDA's Medical Device Software (SaMD) guidelines, or the EU Medical Device Regulation (MDR); it has not been clinically validated in a health care environment; not been prospectively evaluated by patients' outcomes; and has not included the clinical deployment audit trail mechanisms that are required. Any attempt to bring this to actual clinical practice would require compliance with these regulations.</w:t>
       </w:r>
       <w:bookmarkEnd w:id="96"/>
       <w:bookmarkEnd w:id="97"/>
@@ -19907,7 +20909,27 @@
           <w:sz w:val="24"/>
           <w:szCs w:val="24"/>
         </w:rPr>
-        <w:t xml:space="preserve"> fine-tuned model only requires updating 1.30% of the total model parameters, significantly lowering the amount of compute needed to train the model, as well as the storage space required for the trained model, compared with fine-tuning the entire model. Distilled 600M parameter </w:t>
+        <w:t xml:space="preserve"> fine-tuned model only requires updating 1.30% of the total model parameters, significantly lowering the amount of </w:t>
+      </w:r>
+      <w:proofErr w:type="gramStart"/>
+      <w:r>
+        <w:rPr>
+          <w:b w:val="0"/>
+          <w:bCs w:val="0"/>
+          <w:sz w:val="24"/>
+          <w:szCs w:val="24"/>
+        </w:rPr>
+        <w:t>compute</w:t>
+      </w:r>
+      <w:proofErr w:type="gramEnd"/>
+      <w:r>
+        <w:rPr>
+          <w:b w:val="0"/>
+          <w:bCs w:val="0"/>
+          <w:sz w:val="24"/>
+          <w:szCs w:val="24"/>
+        </w:rPr>
+        <w:t xml:space="preserve"> needed to train the model, as well as the storage space required for the trained model, compared with fine-tuning the entire model. Distilled 600M parameter </w:t>
       </w:r>
       <w:r>
         <w:rPr>
@@ -19917,7 +20939,27 @@
           <w:szCs w:val="24"/>
         </w:rPr>
         <w:lastRenderedPageBreak/>
-        <w:t>variant was chosen over the larger 1.3B and 3.3B variants for NLLB-200 to reduce the VRAM usage for stage 2, while the float16 precision brings the VRAM down to about 1.23 GB. This entire 2 stage inference pipeline is deployed on 8.5GB VRAM of test hardware, eliminating the need for cloud resources, extra GPUs or specialized accelerators. Energy-wise, the training process consumed about 25 effective epochs per laptop GPU for several hours, and the deployments would only require energy at inference time; much less demanding than training a large model. Scalability to other South Asian languages is provided by the two stage architecture: To add a new language target, just modify the NLLB-200 target language token, without retraining the core vision/language part of the system.</w:t>
+        <w:t xml:space="preserve">variant was chosen over the larger 1.3B and 3.3B variants for NLLB-200 to reduce the VRAM usage for stage 2, while the float16 precision brings the VRAM down to about 1.23 GB. This entire 2 stage inference pipeline is deployed on 8.5GB VRAM of test hardware, eliminating the need for cloud resources, extra GPUs or specialized accelerators. Energy-wise, the training process consumed about 25 effective epochs per laptop GPU for several hours, and the deployments would only require energy at inference time; much less demanding than training a large model. Scalability to other South Asian languages is provided by the </w:t>
+      </w:r>
+      <w:proofErr w:type="gramStart"/>
+      <w:r>
+        <w:rPr>
+          <w:b w:val="0"/>
+          <w:bCs w:val="0"/>
+          <w:sz w:val="24"/>
+          <w:szCs w:val="24"/>
+        </w:rPr>
+        <w:t>two stage</w:t>
+      </w:r>
+      <w:proofErr w:type="gramEnd"/>
+      <w:r>
+        <w:rPr>
+          <w:b w:val="0"/>
+          <w:bCs w:val="0"/>
+          <w:sz w:val="24"/>
+          <w:szCs w:val="24"/>
+        </w:rPr>
+        <w:t xml:space="preserve"> architecture: To add a new language target, just modify the NLLB-200 target language token, without retraining the core vision/language part of the system.</w:t>
       </w:r>
       <w:bookmarkEnd w:id="99"/>
       <w:bookmarkEnd w:id="100"/>
@@ -20119,7 +21161,87 @@
           <w:sz w:val="24"/>
           <w:szCs w:val="24"/>
         </w:rPr>
-        <w:t>There are a number of ethical considerations in this study. The first one is about bias and fairness of the training data. The IU X-ray dataset consists of data from a single academic hospital in the US, so it is specific to the quality of the equipment, patient population, clinical protocols, and reporting of that hospital. This brings in the bias at the population level: the model can be expected to perform differently with chest X-rays of Bangladeshi patients, as well as with differences in disease prevalence patterns (such as the prevalence of tuberculosis, which is significantly higher in Bangladesh than in the IU dataset) and imaging equipment properties (which can be different for Bangladeshi patients) and clinical documentation conventions; all these factors can result in a different disease burden pattern. The other issue is clinical safety. The system is designed for research purposes and for preliminary reporting only and should not substitute for experienced radiologists. All output must be considered a preliminary product and subject to expert verification and the thesis documentation and communication of any deployments should explicitly and prominently state this fact. The third concern is with regard to the Bangla translation specifically: errors in clinical translation can impact patient care due to misinterpretation of a report by a clinician based on an incorrect Bangla translation of a finding. This risk is partially reduced by the medical glossary post-processing applied in implementing, but it cannot be completely eliminated. The fourth concern is that of data privacy, where no patient identifiable data is utilized in this research, and no new patient data was gathered, but the IU X-ray dataset is a fully anonymized and de-identified public release (</w:t>
+        <w:t xml:space="preserve">There are </w:t>
+      </w:r>
+      <w:proofErr w:type="gramStart"/>
+      <w:r>
+        <w:rPr>
+          <w:b w:val="0"/>
+          <w:bCs w:val="0"/>
+          <w:sz w:val="24"/>
+          <w:szCs w:val="24"/>
+        </w:rPr>
+        <w:t>a number of</w:t>
+      </w:r>
+      <w:proofErr w:type="gramEnd"/>
+      <w:r>
+        <w:rPr>
+          <w:b w:val="0"/>
+          <w:bCs w:val="0"/>
+          <w:sz w:val="24"/>
+          <w:szCs w:val="24"/>
+        </w:rPr>
+        <w:t xml:space="preserve"> ethical considerations in this study. The first one is about bias and fairness of the training data. The IU X-ray dataset consists of data from a single academic hospital in the US, so it is specific to the quality of the equipment, patient population, clinical protocols, and reporting of that hospital. This brings in the bias at the population level: the model can be expected to perform differently with chest X-rays of Bangladeshi patients, as well as with differences in disease prevalence patterns (such as the prevalence of tuberculosis, which is significantly higher in Bangladesh than in the IU dataset) and imaging equipment properties (which can be different for Bangladeshi patients) and clinical documentation conventions; all these factors can result in a different disease burden pattern. The other issue is clinical safety. The system is designed for research purposes and for preliminary reporting only and should not </w:t>
+      </w:r>
+      <w:proofErr w:type="gramStart"/>
+      <w:r>
+        <w:rPr>
+          <w:b w:val="0"/>
+          <w:bCs w:val="0"/>
+          <w:sz w:val="24"/>
+          <w:szCs w:val="24"/>
+        </w:rPr>
+        <w:t>substitute</w:t>
+      </w:r>
+      <w:proofErr w:type="gramEnd"/>
+      <w:r>
+        <w:rPr>
+          <w:b w:val="0"/>
+          <w:bCs w:val="0"/>
+          <w:sz w:val="24"/>
+          <w:szCs w:val="24"/>
+        </w:rPr>
+        <w:t xml:space="preserve"> for experienced radiologists. All output must be considered a preliminary product and subject to expert verification and the thesis documentation and communication of any deployments should explicitly and prominently state this fact. The third concern is </w:t>
+      </w:r>
+      <w:proofErr w:type="gramStart"/>
+      <w:r>
+        <w:rPr>
+          <w:b w:val="0"/>
+          <w:bCs w:val="0"/>
+          <w:sz w:val="24"/>
+          <w:szCs w:val="24"/>
+        </w:rPr>
+        <w:t>with regard to</w:t>
+      </w:r>
+      <w:proofErr w:type="gramEnd"/>
+      <w:r>
+        <w:rPr>
+          <w:b w:val="0"/>
+          <w:bCs w:val="0"/>
+          <w:sz w:val="24"/>
+          <w:szCs w:val="24"/>
+        </w:rPr>
+        <w:t xml:space="preserve"> the Bangla translation specifically: errors in clinical translation can impact patient care due to misinterpretation of a report by a clinician based on an incorrect Bangla translation of a finding. This risk is partially reduced by the medical glossary post-processing applied in implementing, but it cannot be </w:t>
+      </w:r>
+      <w:proofErr w:type="gramStart"/>
+      <w:r>
+        <w:rPr>
+          <w:b w:val="0"/>
+          <w:bCs w:val="0"/>
+          <w:sz w:val="24"/>
+          <w:szCs w:val="24"/>
+        </w:rPr>
+        <w:t>completely eliminated</w:t>
+      </w:r>
+      <w:proofErr w:type="gramEnd"/>
+      <w:r>
+        <w:rPr>
+          <w:b w:val="0"/>
+          <w:bCs w:val="0"/>
+          <w:sz w:val="24"/>
+          <w:szCs w:val="24"/>
+        </w:rPr>
+        <w:t>. The fourth concern is that of data privacy, where no patient identifiable data is utilized in this research, and no new patient data was gathered, but the IU X-ray dataset is a fully anonymized and de-identified public release (</w:t>
       </w:r>
       <w:proofErr w:type="spellStart"/>
       <w:r>
@@ -20139,7 +21261,27 @@
           <w:sz w:val="24"/>
           <w:szCs w:val="24"/>
         </w:rPr>
-        <w:t xml:space="preserve"> et al., 2016). No data were sent to external servers for model training and/or evaluation.</w:t>
+        <w:t xml:space="preserve"> et al., 2016). No data </w:t>
+      </w:r>
+      <w:proofErr w:type="gramStart"/>
+      <w:r>
+        <w:rPr>
+          <w:b w:val="0"/>
+          <w:bCs w:val="0"/>
+          <w:sz w:val="24"/>
+          <w:szCs w:val="24"/>
+        </w:rPr>
+        <w:t>were</w:t>
+      </w:r>
+      <w:proofErr w:type="gramEnd"/>
+      <w:r>
+        <w:rPr>
+          <w:b w:val="0"/>
+          <w:bCs w:val="0"/>
+          <w:sz w:val="24"/>
+          <w:szCs w:val="24"/>
+        </w:rPr>
+        <w:t xml:space="preserve"> sent to external servers for model training and/or evaluation.</w:t>
       </w:r>
       <w:bookmarkEnd w:id="105"/>
       <w:bookmarkEnd w:id="106"/>
@@ -20225,7 +21367,47 @@
           <w:szCs w:val="24"/>
         </w:rPr>
         <w:lastRenderedPageBreak/>
-        <w:t>parameters learned from the pooled training corpus. If the system were to be used in the clinic, there would have to be some security and privacy concerns that would have to be addressed. Chest X-Ray images and reports created for patients would be considered sensitive health information under the applicable privacy laws such as Digital Security Act in Bangladesh and international laws like HIPAA and GDPR. The resulting system would need the security features of encrypted storage for input images and generated reports, user access controls (based on user roles) that would limit the viewing rights of reports to qualified clinical staff, audit logging of all model calls for accountability and a data retention policy that would determine the length of time any images and reports should be kept before they are deleted. This offline-first system, which does not need an internet connection when inferring, is a good security feature because it reduces the risk of attacks through network transmission of data.</w:t>
+        <w:t xml:space="preserve">parameters learned from the pooled training corpus. If the system were to be used in the clinic, there would have to be some security and privacy concerns that would have to be addressed. Chest X-Ray images and reports created for patients would be considered sensitive health information under the applicable privacy laws such as Digital Security Act in Bangladesh and international laws like HIPAA and GDPR. The resulting system would need the security features of encrypted storage for input images and generated reports, user access controls (based on user roles) that would limit the viewing rights of reports to qualified clinical staff, audit logging of all </w:t>
+      </w:r>
+      <w:proofErr w:type="gramStart"/>
+      <w:r>
+        <w:rPr>
+          <w:b w:val="0"/>
+          <w:bCs w:val="0"/>
+          <w:sz w:val="24"/>
+          <w:szCs w:val="24"/>
+        </w:rPr>
+        <w:t>model</w:t>
+      </w:r>
+      <w:proofErr w:type="gramEnd"/>
+      <w:r>
+        <w:rPr>
+          <w:b w:val="0"/>
+          <w:bCs w:val="0"/>
+          <w:sz w:val="24"/>
+          <w:szCs w:val="24"/>
+        </w:rPr>
+        <w:t xml:space="preserve"> calls for accountability and a data retention policy that would determine the length of time any images and reports should be kept before they are deleted. This </w:t>
+      </w:r>
+      <w:proofErr w:type="gramStart"/>
+      <w:r>
+        <w:rPr>
+          <w:b w:val="0"/>
+          <w:bCs w:val="0"/>
+          <w:sz w:val="24"/>
+          <w:szCs w:val="24"/>
+        </w:rPr>
+        <w:t>offline-first</w:t>
+      </w:r>
+      <w:proofErr w:type="gramEnd"/>
+      <w:r>
+        <w:rPr>
+          <w:b w:val="0"/>
+          <w:bCs w:val="0"/>
+          <w:sz w:val="24"/>
+          <w:szCs w:val="24"/>
+        </w:rPr>
+        <w:t xml:space="preserve"> system, which does not need an internet connection when inferring, is a good security feature because it reduces the risk of attacks through network transmission of data.</w:t>
       </w:r>
     </w:p>
     <w:p>
@@ -20632,7 +21814,17 @@
           <w:sz w:val="24"/>
           <w:szCs w:val="24"/>
         </w:rPr>
-        <w:t xml:space="preserve">no money was spent. The model weights (RAD-DINO, Phi-3.5 Mini, NLLB-200) are all released as open-source under open </w:t>
+        <w:t xml:space="preserve">no money was spent. The model weights (RAD-DINO, Phi-3.5 Mini, NLLB-200) are all released as open-source under </w:t>
+      </w:r>
+      <w:proofErr w:type="gramStart"/>
+      <w:r>
+        <w:rPr>
+          <w:b w:val="0"/>
+          <w:bCs w:val="0"/>
+          <w:sz w:val="24"/>
+          <w:szCs w:val="24"/>
+        </w:rPr>
+        <w:t xml:space="preserve">open </w:t>
       </w:r>
       <w:r>
         <w:rPr>
@@ -20642,7 +21834,17 @@
           <w:szCs w:val="24"/>
         </w:rPr>
         <w:lastRenderedPageBreak/>
-        <w:t xml:space="preserve">source licenses on </w:t>
+        <w:t>source</w:t>
+      </w:r>
+      <w:proofErr w:type="gramEnd"/>
+      <w:r>
+        <w:rPr>
+          <w:b w:val="0"/>
+          <w:bCs w:val="0"/>
+          <w:sz w:val="24"/>
+          <w:szCs w:val="24"/>
+        </w:rPr>
+        <w:t xml:space="preserve"> licenses on </w:t>
       </w:r>
       <w:proofErr w:type="spellStart"/>
       <w:r>
@@ -20682,7 +21884,67 @@
           <w:sz w:val="24"/>
           <w:szCs w:val="24"/>
         </w:rPr>
-        <w:t xml:space="preserve"> platform of the National Library of Medicine. All software libraries used are open source software which are freely licensed. All training was done on the personal hardware - RTX 5050 Laptop GPU - without incurring cloud compute costs. None of the proprietary annotation tools, clinical databases or subscription based APIs were used at any stage. This zero-budget constraint was not simply a constraint, but a design feature as well, as one of the motivations of the research is to illustrate that a working Bangla radiology AI pipeline can be built without institutional compute infrastructure to make the methodology accessible for researchers in Bangladesh and other low-income settings with similar compute resource constraints. The major cost would be to extend the research towards clinical validation, which would involve professionally written Bangla radiology reports being annotated by trained radiologists, and paying them for their efforts.</w:t>
+        <w:t xml:space="preserve"> platform of the National Library of Medicine. All software libraries used are </w:t>
+      </w:r>
+      <w:proofErr w:type="gramStart"/>
+      <w:r>
+        <w:rPr>
+          <w:b w:val="0"/>
+          <w:bCs w:val="0"/>
+          <w:sz w:val="24"/>
+          <w:szCs w:val="24"/>
+        </w:rPr>
+        <w:t>open source</w:t>
+      </w:r>
+      <w:proofErr w:type="gramEnd"/>
+      <w:r>
+        <w:rPr>
+          <w:b w:val="0"/>
+          <w:bCs w:val="0"/>
+          <w:sz w:val="24"/>
+          <w:szCs w:val="24"/>
+        </w:rPr>
+        <w:t xml:space="preserve"> software which </w:t>
+      </w:r>
+      <w:proofErr w:type="gramStart"/>
+      <w:r>
+        <w:rPr>
+          <w:b w:val="0"/>
+          <w:bCs w:val="0"/>
+          <w:sz w:val="24"/>
+          <w:szCs w:val="24"/>
+        </w:rPr>
+        <w:t>are</w:t>
+      </w:r>
+      <w:proofErr w:type="gramEnd"/>
+      <w:r>
+        <w:rPr>
+          <w:b w:val="0"/>
+          <w:bCs w:val="0"/>
+          <w:sz w:val="24"/>
+          <w:szCs w:val="24"/>
+        </w:rPr>
+        <w:t xml:space="preserve"> freely licensed. All training was done on the personal hardware - RTX 5050 Laptop GPU - without incurring cloud compute costs. None of the proprietary annotation tools, clinical databases or </w:t>
+      </w:r>
+      <w:proofErr w:type="gramStart"/>
+      <w:r>
+        <w:rPr>
+          <w:b w:val="0"/>
+          <w:bCs w:val="0"/>
+          <w:sz w:val="24"/>
+          <w:szCs w:val="24"/>
+        </w:rPr>
+        <w:t>subscription based</w:t>
+      </w:r>
+      <w:proofErr w:type="gramEnd"/>
+      <w:r>
+        <w:rPr>
+          <w:b w:val="0"/>
+          <w:bCs w:val="0"/>
+          <w:sz w:val="24"/>
+          <w:szCs w:val="24"/>
+        </w:rPr>
+        <w:t xml:space="preserve"> APIs were used at any stage. This zero-budget constraint was not simply a constraint, but a design feature as well, as one of the motivations of the research is to illustrate that a working Bangla radiology AI pipeline can be built without institutional compute infrastructure to make the methodology accessible for researchers in Bangladesh and other low-income settings with similar compute resource constraints. The major cost would be to extend the research towards clinical validation, which would involve professionally written Bangla radiology reports being annotated by trained radiologists, and paying them for their efforts.</w:t>
       </w:r>
       <w:bookmarkEnd w:id="117"/>
       <w:bookmarkEnd w:id="118"/>
@@ -20754,7 +22016,27 @@
           <w:sz w:val="24"/>
           <w:szCs w:val="24"/>
         </w:rPr>
-        <w:t xml:space="preserve">In this lesson, students examine the process of task breakdown and the project timeline. The research was conducted in six consecutive steps, which took about five months. This first phase (lasting about three weeks) was dedicated to the identification of the problem and the literature survey, which included a systematic review of 30 papers from different domains: radiology report generation, Bangla NLP, multilingual clinical NLP, and AI in low-resource healthcare, and eventually, a well-defined research gap and research goals. The second phase lasted 2 weeks and involved downloading the IU X-ray dataset, writing the filter and merge pipeline, making the train/validation/test splits and checking the availability of the images and completeness of the reports. The third phase, which lasted around four weeks, focused on the design of the </w:t>
+        <w:t xml:space="preserve">In this lesson, students examine the process of task breakdown and the project timeline. The research was conducted in six consecutive steps, which took about five months. This first phase (lasting about three weeks) was dedicated to the identification of the problem and the literature survey, which included a systematic review of 30 papers from different domains: radiology report generation, Bangla NLP, multilingual clinical NLP, and AI in low-resource healthcare, and eventually, a well-defined research gap and research goals. The second phase lasted 2 weeks and involved downloading the IU X-ray dataset, writing the filter and </w:t>
+      </w:r>
+      <w:proofErr w:type="gramStart"/>
+      <w:r>
+        <w:rPr>
+          <w:b w:val="0"/>
+          <w:bCs w:val="0"/>
+          <w:sz w:val="24"/>
+          <w:szCs w:val="24"/>
+        </w:rPr>
+        <w:t>merge</w:t>
+      </w:r>
+      <w:proofErr w:type="gramEnd"/>
+      <w:r>
+        <w:rPr>
+          <w:b w:val="0"/>
+          <w:bCs w:val="0"/>
+          <w:sz w:val="24"/>
+          <w:szCs w:val="24"/>
+        </w:rPr>
+        <w:t xml:space="preserve"> pipeline, making the train/validation/test splits and checking the availability of the images and completeness of the reports. The third phase, which lasted around four weeks, focused on the design of the </w:t>
       </w:r>
       <w:proofErr w:type="spellStart"/>
       <w:r>
@@ -20814,7 +22096,27 @@
           <w:sz w:val="24"/>
           <w:szCs w:val="24"/>
         </w:rPr>
-        <w:t xml:space="preserve">) over all 550 test cases, and implementing the Stage 2 translation pipeline and its evaluation. The sixth and final phase was a three-week period for the analysis of the results, figure generation and thesis writing. A breakdown of the task </w:t>
+        <w:t xml:space="preserve">) over all 550 test cases, and implementing the Stage 2 translation pipeline and its evaluation. The sixth and final phase was a three-week period for the analysis of the results, figure generation and </w:t>
+      </w:r>
+      <w:proofErr w:type="gramStart"/>
+      <w:r>
+        <w:rPr>
+          <w:b w:val="0"/>
+          <w:bCs w:val="0"/>
+          <w:sz w:val="24"/>
+          <w:szCs w:val="24"/>
+        </w:rPr>
+        <w:t>thesis writing</w:t>
+      </w:r>
+      <w:proofErr w:type="gramEnd"/>
+      <w:r>
+        <w:rPr>
+          <w:b w:val="0"/>
+          <w:bCs w:val="0"/>
+          <w:sz w:val="24"/>
+          <w:szCs w:val="24"/>
+        </w:rPr>
+        <w:t xml:space="preserve">. A breakdown of the task </w:t>
       </w:r>
       <w:r>
         <w:rPr>
@@ -20921,7 +22223,27 @@
           <w:sz w:val="24"/>
           <w:szCs w:val="24"/>
         </w:rPr>
-        <w:t xml:space="preserve">The project is broken down into 5 key milestones. The first milestone is the literature review and problem specification, which is accomplished when the 30 annotated paper reviews are completed and the problem statement and objective set is written. The next milestone is dataset readiness, which means the availability of 3,666 image-report pairs with IU X-rays that have been cleaned and split, file integrity checked and the weighted random sampler is working. The third milestone is the trained </w:t>
+        <w:t xml:space="preserve">The project is broken down into 5 key milestones. The first milestone is the literature review and problem specification, which is accomplished when the 30 annotated paper reviews are completed and the problem statement and objective set </w:t>
+      </w:r>
+      <w:proofErr w:type="gramStart"/>
+      <w:r>
+        <w:rPr>
+          <w:b w:val="0"/>
+          <w:bCs w:val="0"/>
+          <w:sz w:val="24"/>
+          <w:szCs w:val="24"/>
+        </w:rPr>
+        <w:t>is</w:t>
+      </w:r>
+      <w:proofErr w:type="gramEnd"/>
+      <w:r>
+        <w:rPr>
+          <w:b w:val="0"/>
+          <w:bCs w:val="0"/>
+          <w:sz w:val="24"/>
+          <w:szCs w:val="24"/>
+        </w:rPr>
+        <w:t xml:space="preserve"> written. The next milestone is dataset readiness, which means the availability of 3,666 image-report pairs with IU X-rays that have been cleaned and split, file integrity checked and the weighted random sampler is working. The third milestone is the trained </w:t>
       </w:r>
       <w:proofErr w:type="spellStart"/>
       <w:r>
@@ -20941,7 +22263,27 @@
           <w:sz w:val="24"/>
           <w:szCs w:val="24"/>
         </w:rPr>
-        <w:t xml:space="preserve"> Stage 1 model, with the best checkpoint saved from epoch 18 with a validation loss of 0.5516 and 550 English test reports generated and saved to stage2_english_reports.json. The fourth milestone is the ablation study and Stage 2 evaluation, which includes the final comparison table (</w:t>
+        <w:t xml:space="preserve"> Stage 1 model, with the best checkpoint saved from epoch 18 with a validation loss of 0.5516 and 550 English test reports generated and saved to stage2_english_</w:t>
+      </w:r>
+      <w:proofErr w:type="gramStart"/>
+      <w:r>
+        <w:rPr>
+          <w:b w:val="0"/>
+          <w:bCs w:val="0"/>
+          <w:sz w:val="24"/>
+          <w:szCs w:val="24"/>
+        </w:rPr>
+        <w:t>reports.json</w:t>
+      </w:r>
+      <w:proofErr w:type="gramEnd"/>
+      <w:r>
+        <w:rPr>
+          <w:b w:val="0"/>
+          <w:bCs w:val="0"/>
+          <w:sz w:val="24"/>
+          <w:szCs w:val="24"/>
+        </w:rPr>
+        <w:t>. The fourth milestone is the ablation study and Stage 2 evaluation, which includes the final comparison table (</w:t>
       </w:r>
       <w:proofErr w:type="spellStart"/>
       <w:r>
@@ -20981,7 +22323,27 @@
           <w:sz w:val="24"/>
           <w:szCs w:val="24"/>
         </w:rPr>
-        <w:t>) for all metrics and the Bangla evaluation results are recorded in stage2_bangla_full.json. The sixth and last milestone is the finished thesis with all six chapters, all references listed in the APA format and the six visualization figures created during the ablation phase. For every milestone there is a clear, tangible, and verifiable deliverable, such as a document or a saved file or a set of measurable numerical results, that can be measured, and that the research can be fully reproduced from the available artifacts.</w:t>
+        <w:t>) for all metrics and the Bangla evaluation results are recorded in stage2_bangla_</w:t>
+      </w:r>
+      <w:proofErr w:type="gramStart"/>
+      <w:r>
+        <w:rPr>
+          <w:b w:val="0"/>
+          <w:bCs w:val="0"/>
+          <w:sz w:val="24"/>
+          <w:szCs w:val="24"/>
+        </w:rPr>
+        <w:t>full.json</w:t>
+      </w:r>
+      <w:proofErr w:type="gramEnd"/>
+      <w:r>
+        <w:rPr>
+          <w:b w:val="0"/>
+          <w:bCs w:val="0"/>
+          <w:sz w:val="24"/>
+          <w:szCs w:val="24"/>
+        </w:rPr>
+        <w:t>. The sixth and last milestone is the finished thesis with all six chapters, all references listed in the APA format and the six visualization figures created during the ablation phase. For every milestone there is a clear, tangible, and verifiable deliverable, such as a document or a saved file or a set of measurable numerical results, that can be measured, and that the research can be fully reproduced from the available artifacts.</w:t>
       </w:r>
       <w:bookmarkEnd w:id="123"/>
       <w:bookmarkEnd w:id="124"/>
@@ -21033,6 +22395,7 @@
         </w:rPr>
         <w:t xml:space="preserve">The Gantt chart for this project illustrates the six project phases, relating them to a 5-month </w:t>
       </w:r>
+      <w:proofErr w:type="gramStart"/>
       <w:r>
         <w:rPr>
           <w:b w:val="0"/>
@@ -21041,7 +22404,37 @@
           <w:szCs w:val="24"/>
         </w:rPr>
         <w:lastRenderedPageBreak/>
-        <w:t>time period from the initiation of the project until thesis submission. The phases are represented by horizontal bars across the weeks of their allocated time and the dependency between the phases is reflected in the sequential arrangement of the bars from literature review to dataset preparation, through architecture design, training, evaluation and documentation. Some phases occurred in parallel, such as the early training phase and the architecture refinements, where documentation and analysis started concurrently with the initial evaluation runs, rather than waiting for all results to be consolidated, and documentation and problem statement formation started during the initial literature review phase, which continued while some of the architecture refinements were performed. Training and evaluation is a critical path, where the 550 English test reports, and the Ablation comparison was a prerequisite for all the following stage 2 evaluation and for the results discussion in the thesis. Although not an idealized plan, the Gantt chart is presented as Figure 7 in the appendix, and shows the actual timeline that was followed, rather than what may have been ideal.</w:t>
+        <w:t>time period</w:t>
+      </w:r>
+      <w:proofErr w:type="gramEnd"/>
+      <w:r>
+        <w:rPr>
+          <w:b w:val="0"/>
+          <w:bCs w:val="0"/>
+          <w:sz w:val="24"/>
+          <w:szCs w:val="24"/>
+        </w:rPr>
+        <w:t xml:space="preserve"> from the initiation of the project until thesis submission. The phases are represented by horizontal bars across the weeks of their allocated time and the dependency between the phases is reflected in the sequential arrangement of the bars from literature review to dataset preparation, through architecture design, training, evaluation and documentation. Some phases occurred in parallel, such as the early training phase and the architecture refinements, where documentation and analysis started concurrently with the initial evaluation runs, rather than waiting for all results to be consolidated, and documentation and problem statement formation started during the initial literature review phase, which continued while some of the architecture refinements were performed. Training and evaluation </w:t>
+      </w:r>
+      <w:proofErr w:type="gramStart"/>
+      <w:r>
+        <w:rPr>
+          <w:b w:val="0"/>
+          <w:bCs w:val="0"/>
+          <w:sz w:val="24"/>
+          <w:szCs w:val="24"/>
+        </w:rPr>
+        <w:t>is</w:t>
+      </w:r>
+      <w:proofErr w:type="gramEnd"/>
+      <w:r>
+        <w:rPr>
+          <w:b w:val="0"/>
+          <w:bCs w:val="0"/>
+          <w:sz w:val="24"/>
+          <w:szCs w:val="24"/>
+        </w:rPr>
+        <w:t xml:space="preserve"> a critical path, where the 550 English test reports, and the Ablation comparison was a prerequisite for all the following stage 2 evaluation and for the results discussion in the thesis. Although not an idealized plan, the Gantt chart is presented as Figure 7 in the appendix, and shows the actual timeline that was followed, rather than what may have been ideal.</w:t>
       </w:r>
       <w:bookmarkEnd w:id="126"/>
       <w:bookmarkEnd w:id="127"/>
@@ -21312,7 +22705,27 @@
           <w:sz w:val="24"/>
           <w:szCs w:val="24"/>
         </w:rPr>
-        <w:t xml:space="preserve">The aim of this thesis was to fill in this important, yet practically needed void: a completely missing resource of AI-assisted reporting of chest X-rays in Bangla, the native language of more than 170 million people, and where a radiologist is available for less than one person in every 200,000 people. We have designed, implemented and evaluated </w:t>
+        <w:t xml:space="preserve">The aim of this thesis was to fill in this </w:t>
+      </w:r>
+      <w:proofErr w:type="gramStart"/>
+      <w:r>
+        <w:rPr>
+          <w:b w:val="0"/>
+          <w:bCs w:val="0"/>
+          <w:sz w:val="24"/>
+          <w:szCs w:val="24"/>
+        </w:rPr>
+        <w:t>important, yet</w:t>
+      </w:r>
+      <w:proofErr w:type="gramEnd"/>
+      <w:r>
+        <w:rPr>
+          <w:b w:val="0"/>
+          <w:bCs w:val="0"/>
+          <w:sz w:val="24"/>
+          <w:szCs w:val="24"/>
+        </w:rPr>
+        <w:t xml:space="preserve"> practically needed void: a completely missing resource of AI-assisted reporting of chest X-rays in Bangla, the native language of more than 170 million people, and where a radiologist is available for less than one person in every 200,000 people. We have designed, implemented and evaluated </w:t>
       </w:r>
       <w:proofErr w:type="spellStart"/>
       <w:r>
@@ -21332,7 +22745,27 @@
           <w:sz w:val="24"/>
           <w:szCs w:val="24"/>
         </w:rPr>
-        <w:t xml:space="preserve">, a two stage pipeline of vision-to-language and language-to-vision. The first stage is made up of a frozen RAD-DINO vision encoder, a novel cross-attention module named </w:t>
+        <w:t xml:space="preserve">, a </w:t>
+      </w:r>
+      <w:proofErr w:type="gramStart"/>
+      <w:r>
+        <w:rPr>
+          <w:b w:val="0"/>
+          <w:bCs w:val="0"/>
+          <w:sz w:val="24"/>
+          <w:szCs w:val="24"/>
+        </w:rPr>
+        <w:t>two stage</w:t>
+      </w:r>
+      <w:proofErr w:type="gramEnd"/>
+      <w:r>
+        <w:rPr>
+          <w:b w:val="0"/>
+          <w:bCs w:val="0"/>
+          <w:sz w:val="24"/>
+          <w:szCs w:val="24"/>
+        </w:rPr>
+        <w:t xml:space="preserve"> pipeline of vision-to-language and language-to-vision. The first stage is made up of a frozen RAD-DINO vision encoder, a novel cross-attention module named </w:t>
       </w:r>
       <w:proofErr w:type="spellStart"/>
       <w:r>
@@ -21372,7 +22805,27 @@
           <w:sz w:val="24"/>
           <w:szCs w:val="24"/>
         </w:rPr>
-        <w:t xml:space="preserve"> fine-tuned Phi-3.5 Mini language model which outputs structured English radiology reports from chest X-ray images. In the second stage, the English reports are translated into Bangla using NLLB-200. The system has been trained and tested on the Indiana University Chest X-ray database, with 2566 training samples, 550 validation samples and 550 test samples being all performed on consumer-grade hardware with 8.5GB VRAM. Stage 1 obtained BLEU-1 score of 0.2884, ROUGE-1 score of 0.4352, METEOR score of 0.2820 and </w:t>
+        <w:t xml:space="preserve"> fine-tuned Phi-3.5 Mini language model which outputs structured English radiology reports from chest X-ray images. In the second stage, the English reports are translated into Bangla using NLLB-200. The system has been trained and tested on the Indiana University Chest X-ray database, with 2566 training samples, 550 validation samples and 550 test samples </w:t>
+      </w:r>
+      <w:proofErr w:type="gramStart"/>
+      <w:r>
+        <w:rPr>
+          <w:b w:val="0"/>
+          <w:bCs w:val="0"/>
+          <w:sz w:val="24"/>
+          <w:szCs w:val="24"/>
+        </w:rPr>
+        <w:t>being all</w:t>
+      </w:r>
+      <w:proofErr w:type="gramEnd"/>
+      <w:r>
+        <w:rPr>
+          <w:b w:val="0"/>
+          <w:bCs w:val="0"/>
+          <w:sz w:val="24"/>
+          <w:szCs w:val="24"/>
+        </w:rPr>
+        <w:t xml:space="preserve"> performed on consumer-grade hardware with 8.5GB VRAM. Stage 1 obtained BLEU-1 score of 0.2884, ROUGE-1 score of 0.4352, METEOR score of 0.2820 and </w:t>
       </w:r>
       <w:proofErr w:type="spellStart"/>
       <w:r>
@@ -21608,7 +23061,27 @@
           <w:szCs w:val="24"/>
         </w:rPr>
         <w:lastRenderedPageBreak/>
-        <w:t>first structured Bangla radiology NLG benchmark with 550 paired English-Bangla evaluated report samples that can be used by future researchers to evaluate and compare Bangla medical text generation models. The fourth is the clinical entity evaluation framework across 12 pathological categories, which serves as a diagnostically-informed supplement to NLG metrics, and gives a more actionable view of clinical deployment readiness than the NLG metrics do individually.</w:t>
+        <w:t xml:space="preserve">first structured Bangla radiology NLG benchmark with 550 paired English-Bangla evaluated report samples that can be used by future researchers to evaluate and compare Bangla medical text generation models. The fourth is the clinical entity evaluation framework across 12 pathological categories, which serves as a </w:t>
+      </w:r>
+      <w:proofErr w:type="gramStart"/>
+      <w:r>
+        <w:rPr>
+          <w:b w:val="0"/>
+          <w:bCs w:val="0"/>
+          <w:sz w:val="24"/>
+          <w:szCs w:val="24"/>
+        </w:rPr>
+        <w:t>diagnostically-informed</w:t>
+      </w:r>
+      <w:proofErr w:type="gramEnd"/>
+      <w:r>
+        <w:rPr>
+          <w:b w:val="0"/>
+          <w:bCs w:val="0"/>
+          <w:sz w:val="24"/>
+          <w:szCs w:val="24"/>
+        </w:rPr>
+        <w:t xml:space="preserve"> supplement to NLG metrics, and gives a more actionable view of clinical deployment readiness than the NLG metrics do individually.</w:t>
       </w:r>
       <w:bookmarkEnd w:id="136"/>
       <w:bookmarkEnd w:id="137"/>
@@ -21723,7 +23196,39 @@
           <w:sz w:val="24"/>
           <w:szCs w:val="24"/>
         </w:rPr>
-        <w:t xml:space="preserve"> performance in detail in relation to the literature. Lastly, there is absolutely no clinical validation of the system: no radiologist has examined the reports provided by the system, no patient outcome data has been gathered and no assessment of clinical “usefulness” has been performed.</w:t>
+        <w:t xml:space="preserve"> performance in detail in relation to the literature. Lastly, there is </w:t>
+      </w:r>
+      <w:proofErr w:type="gramStart"/>
+      <w:r>
+        <w:rPr>
+          <w:sz w:val="24"/>
+          <w:szCs w:val="24"/>
+        </w:rPr>
+        <w:t>absolutely no</w:t>
+      </w:r>
+      <w:proofErr w:type="gramEnd"/>
+      <w:r>
+        <w:rPr>
+          <w:sz w:val="24"/>
+          <w:szCs w:val="24"/>
+        </w:rPr>
+        <w:t xml:space="preserve"> clinical validation of the system: no radiologist has examined the reports provided by the system, no patient outcome data has been </w:t>
+      </w:r>
+      <w:proofErr w:type="gramStart"/>
+      <w:r>
+        <w:rPr>
+          <w:sz w:val="24"/>
+          <w:szCs w:val="24"/>
+        </w:rPr>
+        <w:t>gathered</w:t>
+      </w:r>
+      <w:proofErr w:type="gramEnd"/>
+      <w:r>
+        <w:rPr>
+          <w:sz w:val="24"/>
+          <w:szCs w:val="24"/>
+        </w:rPr>
+        <w:t xml:space="preserve"> and no assessment of clinical “usefulness” has been performed.</w:t>
       </w:r>
     </w:p>
     <w:p>

</xml_diff>